<commit_message>
redactando base de misiones
</commit_message>
<xml_diff>
--- a/docs/Ideas War project.docx
+++ b/docs/Ideas War project.docx
@@ -1,6 +1,7 @@
 
 <file path=word/document.xml><?xml version="1.0" encoding="utf-8"?>
-<w:document xmlns:wpc="http://schemas.microsoft.com/office/word/2010/wordprocessingCanvas" xmlns:cx="http://schemas.microsoft.com/office/drawing/2014/chartex" xmlns:cx1="http://schemas.microsoft.com/office/drawing/2015/9/8/chartex" xmlns:cx2="http://schemas.microsoft.com/office/drawing/2015/10/21/chartex" xmlns:cx3="http://schemas.microsoft.com/office/drawing/2016/5/9/chartex" xmlns:cx4="http://schemas.microsoft.com/office/drawing/2016/5/10/chartex" xmlns:cx5="http://schemas.microsoft.com/office/drawing/2016/5/11/chartex" xmlns:cx6="http://schemas.microsoft.com/office/drawing/2016/5/12/chartex" xmlns:cx7="http://schemas.microsoft.com/office/drawing/2016/5/13/chartex" xmlns:cx8="http://schemas.microsoft.com/office/drawing/2016/5/14/chartex" xmlns:mc="http://schemas.openxmlformats.org/markup-compatibility/2006" xmlns:aink="http://schemas.microsoft.com/office/drawing/2016/ink" xmlns:am3d="http://schemas.microsoft.com/office/drawing/2017/model3d" xmlns:o="urn:schemas-microsoft-com:office:office" xmlns:oel="http://schemas.microsoft.com/office/2019/extlst" xmlns:r="http://schemas.openxmlformats.org/officeDocument/2006/relationships" xmlns:m="http://schemas.openxmlformats.org/officeDocument/2006/math" xmlns:v="urn:schemas-microsoft-com:vml" xmlns:wp14="http://schemas.microsoft.com/office/word/2010/wordprocessingDrawing" xmlns:wp="http://schemas.openxmlformats.org/drawingml/2006/wordprocessingDrawing" xmlns:w10="urn:schemas-microsoft-com:office:word" xmlns:w="http://schemas.openxmlformats.org/wordprocessingml/2006/main" xmlns:w14="http://schemas.microsoft.com/office/word/2010/wordml" xmlns:w15="http://schemas.microsoft.com/office/word/2012/wordml" xmlns:w16cex="http://schemas.microsoft.com/office/word/2018/wordml/cex" xmlns:w16cid="http://schemas.microsoft.com/office/word/2016/wordml/cid" xmlns:w16="http://schemas.microsoft.com/office/word/2018/wordml" xmlns:w16du="http://schemas.microsoft.com/office/word/2023/wordml/word16du" xmlns:w16sdtdh="http://schemas.microsoft.com/office/word/2020/wordml/sdtdatahash" xmlns:w16sdtfl="http://schemas.microsoft.com/office/word/2024/wordml/sdtformatlock" xmlns:w16se="http://schemas.microsoft.com/office/word/2015/wordml/symex" xmlns:wpg="http://schemas.microsoft.com/office/word/2010/wordprocessingGroup" xmlns:wpi="http://schemas.microsoft.com/office/word/2010/wordprocessingInk" xmlns:wne="http://schemas.microsoft.com/office/word/2006/wordml" xmlns:wps="http://schemas.microsoft.com/office/word/2010/wordprocessingShape" mc:Ignorable="w14 w15 w16se w16cid w16 w16cex w16sdtdh w16sdtfl w16du wp14">
+<w:document xmlns:wpc="http://schemas.microsoft.com/office/word/2010/wordprocessingCanvas" xmlns:cx="http://schemas.microsoft.com/office/drawing/2014/chartex" xmlns:mc="http://schemas.openxmlformats.org/markup-compatibility/2006" xmlns:o="urn:schemas-microsoft-com:office:office" xmlns:r="http://schemas.openxmlformats.org/officeDocument/2006/relationships" xmlns:m="http://schemas.openxmlformats.org/officeDocument/2006/math" xmlns:v="urn:schemas-microsoft-com:vml" xmlns:wp14="http://schemas.microsoft.com/office/word/2010/wordprocessingDrawing" xmlns:wp="http://schemas.openxmlformats.org/drawingml/2006/wordprocessingDrawing" xmlns:w10="urn:schemas-microsoft-com:office:word" xmlns:w="http://schemas.openxmlformats.org/wordprocessingml/2006/main" xmlns:w14="http://schemas.microsoft.com/office/word/2010/wordml" xmlns:w15="http://schemas.microsoft.com/office/word/2012/wordml" xmlns:w16se="http://schemas.microsoft.com/office/word/2015/wordml/symex" xmlns:wpg="http://schemas.microsoft.com/office/word/2010/wordprocessingGroup" xmlns:wpi="http://schemas.microsoft.com/office/word/2010/wordprocessingInk" xmlns:wne="http://schemas.microsoft.com/office/word/2006/wordml" xmlns:wps="http://schemas.microsoft.com/office/word/2010/wordprocessingShape" mc:Ignorable="w14 w15 w16se wp14">
+  <w:background w:color="393939" w:themeColor="background2" w:themeShade="3F"/>
   <w:body>
     <w:p>
       <w:pPr>
@@ -140,12 +141,10 @@
         <w:t xml:space="preserve">. Al </w:t>
       </w:r>
       <w:proofErr w:type="spellStart"/>
-      <w:proofErr w:type="gramStart"/>
       <w:r>
         <w:t>click</w:t>
       </w:r>
       <w:proofErr w:type="spellEnd"/>
-      <w:proofErr w:type="gramEnd"/>
       <w:r>
         <w:t>, cámara se enfoca en el evento.</w:t>
       </w:r>
@@ -239,15 +238,7 @@
       </w:r>
       <w:proofErr w:type="spellEnd"/>
       <w:r>
-        <w:t xml:space="preserve"> </w:t>
-      </w:r>
-      <w:proofErr w:type="gramStart"/>
-      <w:r>
-        <w:t>target</w:t>
-      </w:r>
-      <w:proofErr w:type="gramEnd"/>
-      <w:r>
-        <w:t xml:space="preserve">. De este modo si está lejos el TGT se puede ver el objetivo sin perder el control de </w:t>
+        <w:t xml:space="preserve"> target. De este modo si está lejos el TGT se puede ver el objetivo sin perder el control de </w:t>
       </w:r>
       <w:proofErr w:type="spellStart"/>
       <w:r>
@@ -278,12 +269,10 @@
         <w:t xml:space="preserve"> al hacer </w:t>
       </w:r>
       <w:proofErr w:type="spellStart"/>
-      <w:proofErr w:type="gramStart"/>
       <w:r>
         <w:t>click</w:t>
       </w:r>
       <w:proofErr w:type="spellEnd"/>
-      <w:proofErr w:type="gramEnd"/>
       <w:r>
         <w:t xml:space="preserve"> en una unidad. </w:t>
       </w:r>
@@ -461,12 +450,10 @@
         <w:t xml:space="preserve">Se debe poder seleccionar unidades aliadas y atacar desde allí con el </w:t>
       </w:r>
       <w:proofErr w:type="spellStart"/>
-      <w:proofErr w:type="gramStart"/>
       <w:r>
         <w:t>click</w:t>
       </w:r>
       <w:proofErr w:type="spellEnd"/>
-      <w:proofErr w:type="gramEnd"/>
       <w:r>
         <w:t xml:space="preserve"> </w:t>
       </w:r>
@@ -491,12 +478,10 @@
         <w:t xml:space="preserve">Se debe poder navegar unidades aliadas haciendo </w:t>
       </w:r>
       <w:proofErr w:type="spellStart"/>
-      <w:proofErr w:type="gramStart"/>
       <w:r>
         <w:t>click</w:t>
       </w:r>
       <w:proofErr w:type="spellEnd"/>
-      <w:proofErr w:type="gramEnd"/>
       <w:r>
         <w:t xml:space="preserve"> en una coordenada.</w:t>
       </w:r>
@@ -516,21 +501,7 @@
         <w:rPr>
           <w:color w:val="4EA72E" w:themeColor="accent6"/>
         </w:rPr>
-        <w:t xml:space="preserve">3 </w:t>
-      </w:r>
-      <w:proofErr w:type="gramStart"/>
-      <w:r>
-        <w:rPr>
-          <w:color w:val="4EA72E" w:themeColor="accent6"/>
-        </w:rPr>
-        <w:t>Columnas</w:t>
-      </w:r>
-      <w:proofErr w:type="gramEnd"/>
-      <w:r>
-        <w:rPr>
-          <w:color w:val="4EA72E" w:themeColor="accent6"/>
-        </w:rPr>
-        <w:t xml:space="preserve"> o filas para administrar unidades: </w:t>
+        <w:t xml:space="preserve">3 Columnas o filas para administrar unidades: </w:t>
       </w:r>
       <w:r>
         <w:rPr>
@@ -713,7 +684,6 @@
         </w:numPr>
       </w:pPr>
       <w:r>
-        <w:lastRenderedPageBreak/>
         <w:t>Una misión destruyendo un aeródromo gigante y sus instalaciones</w:t>
       </w:r>
     </w:p>
@@ -726,6 +696,7 @@
         </w:numPr>
       </w:pPr>
       <w:r>
+        <w:lastRenderedPageBreak/>
         <w:t>Una misión atacando un tren de carga y líneas de suministro</w:t>
       </w:r>
     </w:p>
@@ -958,8 +929,76 @@
     </w:p>
     <w:p>
       <w:r>
+        <w:t>Como se pierde: Eliminando muchos civiles o unidades neutrales. Perdiendo la nave de comando de la flota (</w:t>
+      </w:r>
+      <w:proofErr w:type="spellStart"/>
+      <w:r>
+        <w:t>lhd</w:t>
+      </w:r>
+      <w:proofErr w:type="spellEnd"/>
+      <w:r>
+        <w:t>). Perdiendo todas las unidades aliadas.</w:t>
+      </w:r>
+    </w:p>
+    <w:p/>
+    <w:p>
+      <w:pPr>
+        <w:rPr>
+          <w:color w:val="0070C0"/>
+        </w:rPr>
+      </w:pPr>
+      <w:r>
+        <w:rPr>
+          <w:color w:val="0070C0"/>
+        </w:rPr>
         <w:lastRenderedPageBreak/>
-        <w:t>Como se pierde: Eliminando muchos civiles o unidades neutrales. Perdiendo la nave de comando de la flota (</w:t>
+        <w:t>MISIÓN #</w:t>
+      </w:r>
+      <w:r>
+        <w:rPr>
+          <w:color w:val="0070C0"/>
+        </w:rPr>
+        <w:t>09</w:t>
+      </w:r>
+      <w:r>
+        <w:rPr>
+          <w:color w:val="0070C0"/>
+        </w:rPr>
+        <w:t xml:space="preserve">: </w:t>
+      </w:r>
+    </w:p>
+    <w:p>
+      <w:r>
+        <w:t xml:space="preserve">IDEA CENTRAL: </w:t>
+      </w:r>
+      <w:r>
+        <w:t>La previa a la entrada a la ciudad. Se deben destruir las fortificaciones defensivas en las afueras de la ciudad. Mientras las unidades aliadas avanzan deberán ser protegidas del fuego de artillería y los bombardeos aéreos.</w:t>
+      </w:r>
+    </w:p>
+    <w:p>
+      <w:r>
+        <w:t>Situación: En las puertas de la ciudad, las tropas del bando enemigo se atrincheran para evitar el ingreso de los aliados a la capital. Los ataques de artillería y las patrullas aéreas enemigas complican el avance.</w:t>
+      </w:r>
+    </w:p>
+    <w:p>
+      <w:r>
+        <w:t xml:space="preserve">Objetivo: Destruir las barricadas y puestos de control enemigo que bloquean el acceso a la ciudad. </w:t>
+      </w:r>
+      <w:r>
+        <w:t>Proteger las unidades aliadas que ingresan a la ciudad.</w:t>
+      </w:r>
+    </w:p>
+    <w:p>
+      <w:r>
+        <w:t>Lo nuevo: Yo que se…</w:t>
+      </w:r>
+    </w:p>
+    <w:p>
+      <w:r>
+        <w:t xml:space="preserve">Como se pierde: </w:t>
+      </w:r>
+      <w:r>
+        <w:t>Perdiendo la nave de comando de la flota (</w:t>
       </w:r>
       <w:proofErr w:type="spellStart"/>
       <w:r>
@@ -967,8 +1006,91 @@
       </w:r>
       <w:proofErr w:type="spellEnd"/>
       <w:r>
-        <w:t>). Perdiendo todas las unidades aliadas.</w:t>
-      </w:r>
+        <w:t xml:space="preserve">). </w:t>
+      </w:r>
+      <w:r>
+        <w:t>Sufriendo excesivas perdidas de las unidades aliadas.</w:t>
+      </w:r>
+    </w:p>
+    <w:p>
+      <w:pPr>
+        <w:rPr>
+          <w:color w:val="0070C0"/>
+        </w:rPr>
+      </w:pPr>
+      <w:r>
+        <w:rPr>
+          <w:color w:val="0070C0"/>
+        </w:rPr>
+        <w:t>MISIÓN #</w:t>
+      </w:r>
+      <w:r>
+        <w:rPr>
+          <w:color w:val="0070C0"/>
+        </w:rPr>
+        <w:t>08</w:t>
+      </w:r>
+      <w:r>
+        <w:rPr>
+          <w:color w:val="0070C0"/>
+        </w:rPr>
+        <w:t xml:space="preserve">: </w:t>
+      </w:r>
+    </w:p>
+    <w:p>
+      <w:r>
+        <w:t>IDEA CENTRAL:</w:t>
+      </w:r>
+      <w:r>
+        <w:t xml:space="preserve"> </w:t>
+      </w:r>
+      <w:r>
+        <w:t>Destruir cuartel general enemigo para diezmar la fuerza militar enemiga, reducir su fuerza defensiva y cortar cadenas de mandos previo a la invasión final.</w:t>
+      </w:r>
+    </w:p>
+    <w:p>
+      <w:r>
+        <w:t>Situación: A punto de iniciar la escalada final, es necesario eliminar la cadena de mando enemiga, y reducir la fuera militar enemiga en la zona para prevenir refuerzos enemigos cercanos.</w:t>
+      </w:r>
+    </w:p>
+    <w:p>
+      <w:r>
+        <w:t>Objetivo: asaltar la base militar enemiga, capturar cuartel general y asegurar la zona.</w:t>
+      </w:r>
+    </w:p>
+    <w:p>
+      <w:r>
+        <w:t xml:space="preserve">Como se pierde: </w:t>
+      </w:r>
+      <w:r>
+        <w:t>Perdiendo la nave de comando de la flota (</w:t>
+      </w:r>
+      <w:proofErr w:type="spellStart"/>
+      <w:r>
+        <w:t>lhd</w:t>
+      </w:r>
+      <w:proofErr w:type="spellEnd"/>
+      <w:r>
+        <w:t>).</w:t>
+      </w:r>
+      <w:r>
+        <w:t xml:space="preserve"> </w:t>
+      </w:r>
+      <w:proofErr w:type="spellStart"/>
+      <w:r>
+        <w:t>Perdiend</w:t>
+      </w:r>
+      <w:proofErr w:type="spellEnd"/>
+      <w:r>
+        <w:t xml:space="preserve"> todas las unidades del jugador.</w:t>
+      </w:r>
+    </w:p>
+    <w:p>
+      <w:pPr>
+        <w:rPr>
+          <w:color w:val="0070C0"/>
+        </w:rPr>
+      </w:pPr>
     </w:p>
     <w:p/>
     <w:p>
@@ -987,7 +1109,7 @@
         <w:rPr>
           <w:color w:val="0070C0"/>
         </w:rPr>
-        <w:t>09</w:t>
+        <w:t>07</w:t>
       </w:r>
       <w:r>
         <w:rPr>
@@ -1006,19 +1128,231 @@
         <w:rPr>
           <w:color w:val="0070C0"/>
         </w:rPr>
+        <w:t>PARTE 2:</w:t>
+      </w:r>
+    </w:p>
+    <w:p>
+      <w:r>
+        <w:t>IDEA</w:t>
+      </w:r>
+      <w:r>
+        <w:t xml:space="preserve"> CENTRAL: Mantener posiciones defensivas en los puentes tomados mientras se esperan refuerzos para organizar una invasión a gran escala para recuperar la capital. Misión con </w:t>
+      </w:r>
+      <w:proofErr w:type="spellStart"/>
+      <w:r>
+        <w:t>timer</w:t>
+      </w:r>
+      <w:proofErr w:type="spellEnd"/>
+      <w:r>
+        <w:t>.</w:t>
+      </w:r>
+    </w:p>
+    <w:p>
+      <w:r>
+        <w:lastRenderedPageBreak/>
+        <w:t xml:space="preserve">Situación: </w:t>
+      </w:r>
+      <w:r>
+        <w:t>Las tropas aliadas han logrado capturar uno o más puentes, refuerzos enemigos vienen en camino para aislar y reducir las tropas aliadas debilitadas por el combate anterior.</w:t>
+      </w:r>
+    </w:p>
+    <w:p>
+      <w:r>
+        <w:t xml:space="preserve">Objetivo: Mantener y defender los puentes restantes mientras llegan refuerzos aliados. </w:t>
+      </w:r>
+    </w:p>
+    <w:p>
+      <w:r>
+        <w:t>Lo nuevo: …</w:t>
+      </w:r>
+    </w:p>
+    <w:p>
+      <w:r>
+        <w:t xml:space="preserve">Como se pierde: </w:t>
+      </w:r>
+      <w:r>
+        <w:t>Perdiendo la nave de comando de la flota (</w:t>
+      </w:r>
+      <w:proofErr w:type="spellStart"/>
+      <w:r>
+        <w:t>lhd</w:t>
+      </w:r>
+      <w:proofErr w:type="spellEnd"/>
+      <w:r>
+        <w:t>)</w:t>
+      </w:r>
+      <w:r>
+        <w:t>. Perdiendo todas las unidades aliadas y del jugador antes que lleguen los refuerzos.</w:t>
+      </w:r>
+    </w:p>
+    <w:p>
+      <w:pPr>
+        <w:rPr>
+          <w:color w:val="0070C0"/>
+        </w:rPr>
+      </w:pPr>
+      <w:r>
+        <w:rPr>
+          <w:color w:val="0070C0"/>
+        </w:rPr>
+        <w:t xml:space="preserve">(idea 2) </w:t>
+      </w:r>
+      <w:r>
+        <w:rPr>
+          <w:color w:val="0070C0"/>
+        </w:rPr>
         <w:t>PARTE 1:</w:t>
       </w:r>
     </w:p>
     <w:p>
       <w:r>
-        <w:t xml:space="preserve">IDEA CENTRAL: </w:t>
-      </w:r>
-      <w:r>
-        <w:t>La previa a la entrada a la ciudad. Se deben destruir las fortificaciones defensivas en las afueras de la ciudad. Mientras las unidades aliadas avanzan deberán ser protegidas del fuego de artillería y los bombardeos aéreos.</w:t>
+        <w:t>IDEA</w:t>
+      </w:r>
+      <w:r>
+        <w:t xml:space="preserve"> CENTRAL: </w:t>
+      </w:r>
+      <w:r>
+        <w:t xml:space="preserve">Tomar los puentes de acceso que conectan la autopista hacia la capital. Evitar que </w:t>
+      </w:r>
+      <w:r>
+        <w:t>los puentes sean autodestruidos y destruir líneas de abastecimiento.</w:t>
+      </w:r>
+    </w:p>
+    <w:p>
+      <w:r>
+        <w:t xml:space="preserve">Situación: </w:t>
+      </w:r>
+      <w:r>
+        <w:t>En un esfuerzo conjunto, las tropas aliadas junto con el jugador realizarán la acometida final para retomar la capital de las fuerzas enemigas. El comienzo de la operación requiere capturar y asegurar los puentes de acceso a la autopista que conecta la ciudad, para movilizar las tropas y los refuerzos desde la costa.</w:t>
+      </w:r>
+    </w:p>
+    <w:p>
+      <w:r>
+        <w:t>Objetivo: capturar y defender los puentes sobre los ríos para obtener una línea de comunicación con la capital</w:t>
+      </w:r>
+      <w:r>
+        <w:t>. Destruir rutas secundarias y vías de suministro enemigas.</w:t>
+      </w:r>
+    </w:p>
+    <w:p>
+      <w:r>
+        <w:t xml:space="preserve">Lo nuevo: </w:t>
+      </w:r>
+      <w:r>
+        <w:t>cómo</w:t>
+      </w:r>
+      <w:r>
+        <w:t xml:space="preserve"> voy a saber, si no hay progresión, ni unidades, ni mecánicas, ni nada.</w:t>
+      </w:r>
+    </w:p>
+    <w:p>
+      <w:r>
+        <w:t>Como se pierde:</w:t>
+      </w:r>
+      <w:r>
+        <w:t xml:space="preserve"> Todos los puentes son destruidos</w:t>
+      </w:r>
+      <w:r>
+        <w:t>, evitando que las tropas aliadas se movilicen a tiempo</w:t>
+      </w:r>
+      <w:r>
+        <w:t>.</w:t>
+      </w:r>
+      <w:r>
+        <w:t xml:space="preserve"> Perdiendo la nave de comando de la flota (</w:t>
+      </w:r>
+      <w:proofErr w:type="spellStart"/>
+      <w:r>
+        <w:t>lhd</w:t>
+      </w:r>
+      <w:proofErr w:type="spellEnd"/>
+      <w:r>
+        <w:t>)</w:t>
+      </w:r>
+      <w:r>
+        <w:t>.</w:t>
       </w:r>
     </w:p>
     <w:p/>
     <w:p>
+      <w:r>
+        <w:rPr>
+          <w:color w:val="0070C0"/>
+        </w:rPr>
+        <w:t xml:space="preserve">Misión </w:t>
+      </w:r>
+      <w:r>
+        <w:rPr>
+          <w:color w:val="0070C0"/>
+        </w:rPr>
+        <w:t>#</w:t>
+      </w:r>
+      <w:r>
+        <w:rPr>
+          <w:color w:val="0070C0"/>
+        </w:rPr>
+        <w:t>06</w:t>
+      </w:r>
+      <w:r>
+        <w:rPr>
+          <w:color w:val="0070C0"/>
+        </w:rPr>
+        <w:t>:</w:t>
+      </w:r>
+      <w:r>
+        <w:t xml:space="preserve"> </w:t>
+      </w:r>
+    </w:p>
+    <w:p>
+      <w:r>
+        <w:t>IDEA CENTRAL: Sin el aeródromo y la base naval cercana, las tropas aliadas pueden comenzar el desembarco en la costa para recuperar la capital aliada.</w:t>
+      </w:r>
+    </w:p>
+    <w:p>
+      <w:r>
+        <w:t xml:space="preserve">Situación: </w:t>
+      </w:r>
+      <w:r>
+        <w:t>Luz verde para</w:t>
+      </w:r>
+      <w:r>
+        <w:t xml:space="preserve"> la operación de asalto anfibio </w:t>
+      </w:r>
+      <w:r>
+        <w:t>que da comienzo a la última operación militar para capturar la ciudad capital aliada.</w:t>
+      </w:r>
+    </w:p>
+    <w:p>
+      <w:r>
+        <w:t>Objetivo: Limpiar las defensas costeras enemigas, apoyar al desembarco aliado y tomar las posiciones defensivas enemigas en la zona.</w:t>
+      </w:r>
+    </w:p>
+    <w:p>
+      <w:r>
+        <w:lastRenderedPageBreak/>
+        <w:t xml:space="preserve">Como se pierde: </w:t>
+      </w:r>
+      <w:r>
+        <w:t>Perdiendo la nave de comando de la flota (</w:t>
+      </w:r>
+      <w:proofErr w:type="spellStart"/>
+      <w:r>
+        <w:t>lhd</w:t>
+      </w:r>
+      <w:proofErr w:type="spellEnd"/>
+      <w:r>
+        <w:t>).</w:t>
+      </w:r>
+      <w:r>
+        <w:t xml:space="preserve"> </w:t>
+      </w:r>
+      <w:bookmarkStart w:id="0" w:name="_GoBack"/>
+      <w:bookmarkEnd w:id="0"/>
+      <w:r>
+        <w:t>Perdiendo el portaaviones aliado. Sufriendo excesivas bajas aliadas durante el desembarco.</w:t>
+      </w:r>
+    </w:p>
+    <w:p>
       <w:pPr>
         <w:rPr>
           <w:color w:val="0070C0"/>
@@ -1034,119 +1368,7 @@
         <w:rPr>
           <w:color w:val="0070C0"/>
         </w:rPr>
-        <w:t>0</w:t>
-      </w:r>
-      <w:r>
-        <w:rPr>
-          <w:color w:val="0070C0"/>
-        </w:rPr>
-        <w:t>8</w:t>
-      </w:r>
-      <w:r>
-        <w:rPr>
-          <w:color w:val="0070C0"/>
-        </w:rPr>
-        <w:t xml:space="preserve">: </w:t>
-      </w:r>
-    </w:p>
-    <w:p>
-      <w:pPr>
-        <w:rPr>
-          <w:color w:val="0070C0"/>
-        </w:rPr>
-      </w:pPr>
-      <w:r>
-        <w:rPr>
-          <w:color w:val="0070C0"/>
-        </w:rPr>
-        <w:t xml:space="preserve">PARTE </w:t>
-      </w:r>
-      <w:r>
-        <w:rPr>
-          <w:color w:val="0070C0"/>
-        </w:rPr>
-        <w:t>2</w:t>
-      </w:r>
-      <w:r>
-        <w:rPr>
-          <w:color w:val="0070C0"/>
-        </w:rPr>
-        <w:t>:</w:t>
-      </w:r>
-    </w:p>
-    <w:p>
-      <w:r>
-        <w:t>IDEA</w:t>
-      </w:r>
-      <w:r>
-        <w:t xml:space="preserve"> CENTRAL: </w:t>
-      </w:r>
-      <w:r>
-        <w:t>Mantener posiciones defensivas en los puentes tomados mientras se esperan refuerzos para organizar una invasión a gran escala para recuperar la capital</w:t>
-      </w:r>
-      <w:r>
-        <w:t>.</w:t>
-      </w:r>
-      <w:r>
-        <w:t xml:space="preserve"> Misión con </w:t>
-      </w:r>
-      <w:proofErr w:type="spellStart"/>
-      <w:r>
-        <w:t>timer</w:t>
-      </w:r>
-      <w:proofErr w:type="spellEnd"/>
-      <w:r>
-        <w:t>.</w:t>
-      </w:r>
-    </w:p>
-    <w:p>
-      <w:pPr>
-        <w:rPr>
-          <w:color w:val="0070C0"/>
-        </w:rPr>
-      </w:pPr>
-      <w:r>
-        <w:rPr>
-          <w:color w:val="0070C0"/>
-        </w:rPr>
-        <w:t>PARTE 1:</w:t>
-      </w:r>
-    </w:p>
-    <w:p>
-      <w:r>
-        <w:t>IDEA</w:t>
-      </w:r>
-      <w:r>
-        <w:t xml:space="preserve"> CENTRAL: </w:t>
-      </w:r>
-      <w:r>
-        <w:t>Tomar los puentes de acceso que conectan la autopista hacia la capital. Evitar que los puentes sean autodestruidos.</w:t>
-      </w:r>
-    </w:p>
-    <w:p/>
-    <w:p>
-      <w:pPr>
-        <w:rPr>
-          <w:color w:val="0070C0"/>
-        </w:rPr>
-      </w:pPr>
-      <w:r>
-        <w:rPr>
-          <w:color w:val="0070C0"/>
-        </w:rPr>
-        <w:t>MISIÓN #</w:t>
-      </w:r>
-      <w:r>
-        <w:rPr>
-          <w:color w:val="0070C0"/>
-        </w:rPr>
-        <w:t>0</w:t>
-      </w:r>
-      <w:r>
-        <w:rPr>
-          <w:color w:val="0070C0"/>
-        </w:rPr>
-        <w:t>7</w:t>
+        <w:t>05</w:t>
       </w:r>
       <w:r>
         <w:rPr>
@@ -1193,7 +1415,7 @@
 </file>
 
 <file path=word/numbering.xml><?xml version="1.0" encoding="utf-8"?>
-<w:numbering xmlns:wpc="http://schemas.microsoft.com/office/word/2010/wordprocessingCanvas" xmlns:cx="http://schemas.microsoft.com/office/drawing/2014/chartex" xmlns:cx1="http://schemas.microsoft.com/office/drawing/2015/9/8/chartex" xmlns:cx2="http://schemas.microsoft.com/office/drawing/2015/10/21/chartex" xmlns:cx3="http://schemas.microsoft.com/office/drawing/2016/5/9/chartex" xmlns:cx4="http://schemas.microsoft.com/office/drawing/2016/5/10/chartex" xmlns:cx5="http://schemas.microsoft.com/office/drawing/2016/5/11/chartex" xmlns:cx6="http://schemas.microsoft.com/office/drawing/2016/5/12/chartex" xmlns:cx7="http://schemas.microsoft.com/office/drawing/2016/5/13/chartex" xmlns:cx8="http://schemas.microsoft.com/office/drawing/2016/5/14/chartex" xmlns:mc="http://schemas.openxmlformats.org/markup-compatibility/2006" xmlns:aink="http://schemas.microsoft.com/office/drawing/2016/ink" xmlns:am3d="http://schemas.microsoft.com/office/drawing/2017/model3d" xmlns:o="urn:schemas-microsoft-com:office:office" xmlns:oel="http://schemas.microsoft.com/office/2019/extlst" xmlns:r="http://schemas.openxmlformats.org/officeDocument/2006/relationships" xmlns:m="http://schemas.openxmlformats.org/officeDocument/2006/math" xmlns:v="urn:schemas-microsoft-com:vml" xmlns:wp14="http://schemas.microsoft.com/office/word/2010/wordprocessingDrawing" xmlns:wp="http://schemas.openxmlformats.org/drawingml/2006/wordprocessingDrawing" xmlns:w10="urn:schemas-microsoft-com:office:word" xmlns:w="http://schemas.openxmlformats.org/wordprocessingml/2006/main" xmlns:w14="http://schemas.microsoft.com/office/word/2010/wordml" xmlns:w15="http://schemas.microsoft.com/office/word/2012/wordml" xmlns:w16cex="http://schemas.microsoft.com/office/word/2018/wordml/cex" xmlns:w16cid="http://schemas.microsoft.com/office/word/2016/wordml/cid" xmlns:w16="http://schemas.microsoft.com/office/word/2018/wordml" xmlns:w16du="http://schemas.microsoft.com/office/word/2023/wordml/word16du" xmlns:w16sdtdh="http://schemas.microsoft.com/office/word/2020/wordml/sdtdatahash" xmlns:w16sdtfl="http://schemas.microsoft.com/office/word/2024/wordml/sdtformatlock" xmlns:w16se="http://schemas.microsoft.com/office/word/2015/wordml/symex" xmlns:wpg="http://schemas.microsoft.com/office/word/2010/wordprocessingGroup" xmlns:wpi="http://schemas.microsoft.com/office/word/2010/wordprocessingInk" xmlns:wne="http://schemas.microsoft.com/office/word/2006/wordml" xmlns:wps="http://schemas.microsoft.com/office/word/2010/wordprocessingShape" mc:Ignorable="w14 w15 w16se w16cid w16 w16cex w16sdtdh w16sdtfl w16du wp14">
+<w:numbering xmlns:wpc="http://schemas.microsoft.com/office/word/2010/wordprocessingCanvas" xmlns:cx="http://schemas.microsoft.com/office/drawing/2014/chartex" xmlns:mc="http://schemas.openxmlformats.org/markup-compatibility/2006" xmlns:o="urn:schemas-microsoft-com:office:office" xmlns:r="http://schemas.openxmlformats.org/officeDocument/2006/relationships" xmlns:m="http://schemas.openxmlformats.org/officeDocument/2006/math" xmlns:v="urn:schemas-microsoft-com:vml" xmlns:wp14="http://schemas.microsoft.com/office/word/2010/wordprocessingDrawing" xmlns:wp="http://schemas.openxmlformats.org/drawingml/2006/wordprocessingDrawing" xmlns:w10="urn:schemas-microsoft-com:office:word" xmlns:w="http://schemas.openxmlformats.org/wordprocessingml/2006/main" xmlns:w14="http://schemas.microsoft.com/office/word/2010/wordml" xmlns:w15="http://schemas.microsoft.com/office/word/2012/wordml" xmlns:w16se="http://schemas.microsoft.com/office/word/2015/wordml/symex" xmlns:wpg="http://schemas.microsoft.com/office/word/2010/wordprocessingGroup" xmlns:wpi="http://schemas.microsoft.com/office/word/2010/wordprocessingInk" xmlns:wne="http://schemas.microsoft.com/office/word/2006/wordml" xmlns:wps="http://schemas.microsoft.com/office/word/2010/wordprocessingShape" mc:Ignorable="w14 w15 w16se wp14">
   <w:abstractNum w:abstractNumId="0" w15:restartNumberingAfterBreak="0">
     <w:nsid w:val="267473F3"/>
     <w:multiLevelType w:val="hybridMultilevel"/>
@@ -1577,23 +1799,23 @@
       </w:pPr>
     </w:lvl>
   </w:abstractNum>
-  <w:num w:numId="1" w16cid:durableId="1162891110">
+  <w:num w:numId="1">
     <w:abstractNumId w:val="2"/>
   </w:num>
-  <w:num w:numId="2" w16cid:durableId="510686116">
+  <w:num w:numId="2">
     <w:abstractNumId w:val="3"/>
   </w:num>
-  <w:num w:numId="3" w16cid:durableId="305088843">
+  <w:num w:numId="3">
     <w:abstractNumId w:val="0"/>
   </w:num>
-  <w:num w:numId="4" w16cid:durableId="1076704882">
+  <w:num w:numId="4">
     <w:abstractNumId w:val="1"/>
   </w:num>
 </w:numbering>
 </file>
 
 <file path=word/styles.xml><?xml version="1.0" encoding="utf-8"?>
-<w:styles xmlns:mc="http://schemas.openxmlformats.org/markup-compatibility/2006" xmlns:r="http://schemas.openxmlformats.org/officeDocument/2006/relationships" xmlns:w="http://schemas.openxmlformats.org/wordprocessingml/2006/main" xmlns:w14="http://schemas.microsoft.com/office/word/2010/wordml" xmlns:w15="http://schemas.microsoft.com/office/word/2012/wordml" xmlns:w16cex="http://schemas.microsoft.com/office/word/2018/wordml/cex" xmlns:w16cid="http://schemas.microsoft.com/office/word/2016/wordml/cid" xmlns:w16="http://schemas.microsoft.com/office/word/2018/wordml" xmlns:w16du="http://schemas.microsoft.com/office/word/2023/wordml/word16du" xmlns:w16sdtdh="http://schemas.microsoft.com/office/word/2020/wordml/sdtdatahash" xmlns:w16sdtfl="http://schemas.microsoft.com/office/word/2024/wordml/sdtformatlock" xmlns:w16se="http://schemas.microsoft.com/office/word/2015/wordml/symex" mc:Ignorable="w14 w15 w16se w16cid w16 w16cex w16sdtdh w16sdtfl w16du">
+<w:styles xmlns:mc="http://schemas.openxmlformats.org/markup-compatibility/2006" xmlns:r="http://schemas.openxmlformats.org/officeDocument/2006/relationships" xmlns:w="http://schemas.openxmlformats.org/wordprocessingml/2006/main" xmlns:w14="http://schemas.microsoft.com/office/word/2010/wordml" xmlns:w15="http://schemas.microsoft.com/office/word/2012/wordml" xmlns:w16se="http://schemas.microsoft.com/office/word/2015/wordml/symex" mc:Ignorable="w14 w15 w16se">
   <w:docDefaults>
     <w:rPrDefault>
       <w:rPr>
@@ -1611,7 +1833,7 @@
       </w:pPr>
     </w:pPrDefault>
   </w:docDefaults>
-  <w:latentStyles w:defLockedState="0" w:defUIPriority="99" w:defSemiHidden="0" w:defUnhideWhenUsed="0" w:defQFormat="0" w:count="376">
+  <w:latentStyles w:defLockedState="0" w:defUIPriority="99" w:defSemiHidden="0" w:defUnhideWhenUsed="0" w:defQFormat="0" w:count="371">
     <w:lsdException w:name="Normal" w:uiPriority="0" w:qFormat="1"/>
     <w:lsdException w:name="heading 1" w:uiPriority="9" w:qFormat="1"/>
     <w:lsdException w:name="heading 2" w:semiHidden="1" w:uiPriority="9" w:unhideWhenUsed="1" w:qFormat="1"/>
@@ -1983,11 +2205,6 @@
     <w:lsdException w:name="List Table 5 Dark Accent 6" w:uiPriority="50"/>
     <w:lsdException w:name="List Table 6 Colorful Accent 6" w:uiPriority="51"/>
     <w:lsdException w:name="List Table 7 Colorful Accent 6" w:uiPriority="52"/>
-    <w:lsdException w:name="Mention" w:semiHidden="1" w:unhideWhenUsed="1"/>
-    <w:lsdException w:name="Smart Hyperlink" w:semiHidden="1" w:unhideWhenUsed="1"/>
-    <w:lsdException w:name="Hashtag" w:semiHidden="1" w:unhideWhenUsed="1"/>
-    <w:lsdException w:name="Unresolved Mention" w:semiHidden="1" w:unhideWhenUsed="1"/>
-    <w:lsdException w:name="Smart Link" w:semiHidden="1" w:unhideWhenUsed="1"/>
   </w:latentStyles>
   <w:style w:type="paragraph" w:default="1" w:styleId="Normal">
     <w:name w:val="Normal"/>

</xml_diff>

<commit_message>
11 misiones definidas por ahora
</commit_message>
<xml_diff>
--- a/docs/Ideas War project.docx
+++ b/docs/Ideas War project.docx
@@ -1,6 +1,6 @@
 
 <file path=word/document.xml><?xml version="1.0" encoding="utf-8"?>
-<w:document xmlns:wpc="http://schemas.microsoft.com/office/word/2010/wordprocessingCanvas" xmlns:cx="http://schemas.microsoft.com/office/drawing/2014/chartex" xmlns:cx1="http://schemas.microsoft.com/office/drawing/2015/9/8/chartex" xmlns:cx2="http://schemas.microsoft.com/office/drawing/2015/10/21/chartex" xmlns:cx3="http://schemas.microsoft.com/office/drawing/2016/5/9/chartex" xmlns:cx4="http://schemas.microsoft.com/office/drawing/2016/5/10/chartex" xmlns:cx5="http://schemas.microsoft.com/office/drawing/2016/5/11/chartex" xmlns:cx6="http://schemas.microsoft.com/office/drawing/2016/5/12/chartex" xmlns:cx7="http://schemas.microsoft.com/office/drawing/2016/5/13/chartex" xmlns:cx8="http://schemas.microsoft.com/office/drawing/2016/5/14/chartex" xmlns:mc="http://schemas.openxmlformats.org/markup-compatibility/2006" xmlns:aink="http://schemas.microsoft.com/office/drawing/2016/ink" xmlns:am3d="http://schemas.microsoft.com/office/drawing/2017/model3d" xmlns:o="urn:schemas-microsoft-com:office:office" xmlns:oel="http://schemas.microsoft.com/office/2019/extlst" xmlns:r="http://schemas.openxmlformats.org/officeDocument/2006/relationships" xmlns:m="http://schemas.openxmlformats.org/officeDocument/2006/math" xmlns:v="urn:schemas-microsoft-com:vml" xmlns:wp14="http://schemas.microsoft.com/office/word/2010/wordprocessingDrawing" xmlns:wp="http://schemas.openxmlformats.org/drawingml/2006/wordprocessingDrawing" xmlns:w10="urn:schemas-microsoft-com:office:word" xmlns:w="http://schemas.openxmlformats.org/wordprocessingml/2006/main" xmlns:w14="http://schemas.microsoft.com/office/word/2010/wordml" xmlns:w15="http://schemas.microsoft.com/office/word/2012/wordml" xmlns:w16cex="http://schemas.microsoft.com/office/word/2018/wordml/cex" xmlns:w16cid="http://schemas.microsoft.com/office/word/2016/wordml/cid" xmlns:w16="http://schemas.microsoft.com/office/word/2018/wordml" xmlns:w16du="http://schemas.microsoft.com/office/word/2023/wordml/word16du" xmlns:w16sdtdh="http://schemas.microsoft.com/office/word/2020/wordml/sdtdatahash" xmlns:w16sdtfl="http://schemas.microsoft.com/office/word/2024/wordml/sdtformatlock" xmlns:w16se="http://schemas.microsoft.com/office/word/2015/wordml/symex" xmlns:wpg="http://schemas.microsoft.com/office/word/2010/wordprocessingGroup" xmlns:wpi="http://schemas.microsoft.com/office/word/2010/wordprocessingInk" xmlns:wne="http://schemas.microsoft.com/office/word/2006/wordml" xmlns:wps="http://schemas.microsoft.com/office/word/2010/wordprocessingShape" mc:Ignorable="w14 w15 w16se w16cid w16 w16cex w16sdtdh w16sdtfl w16du wp14">
+<w:document xmlns:wpc="http://schemas.microsoft.com/office/word/2010/wordprocessingCanvas" xmlns:cx="http://schemas.microsoft.com/office/drawing/2014/chartex" xmlns:mc="http://schemas.openxmlformats.org/markup-compatibility/2006" xmlns:o="urn:schemas-microsoft-com:office:office" xmlns:r="http://schemas.openxmlformats.org/officeDocument/2006/relationships" xmlns:m="http://schemas.openxmlformats.org/officeDocument/2006/math" xmlns:v="urn:schemas-microsoft-com:vml" xmlns:wp14="http://schemas.microsoft.com/office/word/2010/wordprocessingDrawing" xmlns:wp="http://schemas.openxmlformats.org/drawingml/2006/wordprocessingDrawing" xmlns:w10="urn:schemas-microsoft-com:office:word" xmlns:w="http://schemas.openxmlformats.org/wordprocessingml/2006/main" xmlns:w14="http://schemas.microsoft.com/office/word/2010/wordml" xmlns:w15="http://schemas.microsoft.com/office/word/2012/wordml" xmlns:w16se="http://schemas.microsoft.com/office/word/2015/wordml/symex" xmlns:wpg="http://schemas.microsoft.com/office/word/2010/wordprocessingGroup" xmlns:wpi="http://schemas.microsoft.com/office/word/2010/wordprocessingInk" xmlns:wne="http://schemas.microsoft.com/office/word/2006/wordml" xmlns:wps="http://schemas.microsoft.com/office/word/2010/wordprocessingShape" mc:Ignorable="w14 w15 w16se wp14">
   <w:background w:color="FFFFFF" w:themeColor="background1"/>
   <w:body>
     <w:p>
@@ -158,7 +158,15 @@
         </w:numPr>
       </w:pPr>
       <w:r>
-        <w:t>En modo manual los tanques tienen  un marcador visual bajo el cañón que indica la distancia mínima de disparo de sus armas. Podría aplicar para barcos.</w:t>
+        <w:t xml:space="preserve">En modo manual los tanques </w:t>
+      </w:r>
+      <w:proofErr w:type="gramStart"/>
+      <w:r>
+        <w:t>tienen  un</w:t>
+      </w:r>
+      <w:proofErr w:type="gramEnd"/>
+      <w:r>
+        <w:t xml:space="preserve"> marcador visual bajo el cañón que indica la distancia mínima de disparo de sus armas. Podría aplicar para barcos.</w:t>
       </w:r>
     </w:p>
     <w:p>
@@ -170,7 +178,15 @@
         </w:numPr>
       </w:pPr>
       <w:r>
-        <w:t xml:space="preserve">¡! (ESTE PUEDE REDUNDAR PORQUE SE PUEDE SCROLLEAR POR EL MAPA CON UNIDAD SELECCIONADA) Para armas principales a distancia, el jugador presiona un botón “TGT” que  abre una ventana “cámara” que permite navegar el mapa y seleccionar objetivos. </w:t>
+        <w:t xml:space="preserve">¡! (ESTE PUEDE REDUNDAR PORQUE SE PUEDE SCROLLEAR POR EL MAPA CON UNIDAD SELECCIONADA) Para armas principales a distancia, el jugador presiona un botón “TGT” </w:t>
+      </w:r>
+      <w:proofErr w:type="gramStart"/>
+      <w:r>
+        <w:t>que  abre</w:t>
+      </w:r>
+      <w:proofErr w:type="gramEnd"/>
+      <w:r>
+        <w:t xml:space="preserve"> una ventana “cámara” que permite navegar el mapa y seleccionar objetivos. </w:t>
       </w:r>
     </w:p>
     <w:p>
@@ -338,6 +354,7 @@
           <w:numId w:val="2"/>
         </w:numPr>
       </w:pPr>
+      <w:proofErr w:type="gramStart"/>
       <w:r>
         <w:lastRenderedPageBreak/>
         <w:t xml:space="preserve">Debe tener un texto cada </w:t>
@@ -356,7 +373,11 @@
       </w:r>
       <w:proofErr w:type="spellEnd"/>
       <w:r>
-        <w:t xml:space="preserve"> 2!” por ejemplo.</w:t>
+        <w:t xml:space="preserve"> 2!</w:t>
+      </w:r>
+      <w:proofErr w:type="gramEnd"/>
+      <w:r>
+        <w:t>” por ejemplo.</w:t>
       </w:r>
     </w:p>
     <w:p>
@@ -663,7 +684,6 @@
         </w:numPr>
       </w:pPr>
       <w:r>
-        <w:lastRenderedPageBreak/>
         <w:t>Una misión destruyendo un aeródromo gigante y sus instalaciones</w:t>
       </w:r>
     </w:p>
@@ -676,6 +696,7 @@
         </w:numPr>
       </w:pPr>
       <w:r>
+        <w:lastRenderedPageBreak/>
         <w:t>Una misión atacando un tren de carga y líneas de suministro</w:t>
       </w:r>
     </w:p>
@@ -735,6 +756,7 @@
           <w:numId w:val="3"/>
         </w:numPr>
       </w:pPr>
+      <w:proofErr w:type="gramStart"/>
       <w:r>
         <w:t>Escolta y protección de bombarderos</w:t>
       </w:r>
@@ -749,6 +771,7 @@
       <w:r>
         <w:t xml:space="preserve"> B-52 o B2?</w:t>
       </w:r>
+      <w:proofErr w:type="gramEnd"/>
       <w:r>
         <w:t xml:space="preserve"> (puro A2A </w:t>
       </w:r>
@@ -855,8 +878,10 @@
         <w:rPr>
           <w:color w:val="0070C0"/>
         </w:rPr>
-        <w:t>MISIÓN #10</w:t>
-      </w:r>
+        <w:t>MISIÓN #11</w:t>
+      </w:r>
+      <w:bookmarkStart w:id="0" w:name="_GoBack"/>
+      <w:bookmarkEnd w:id="0"/>
       <w:r>
         <w:rPr>
           <w:color w:val="0070C0"/>
@@ -906,8 +931,76 @@
     </w:p>
     <w:p>
       <w:r>
+        <w:t>Como se pierde: Eliminando muchos civiles o unidades neutrales. Perdiendo la nave de comando de la flota (</w:t>
+      </w:r>
+      <w:proofErr w:type="spellStart"/>
+      <w:r>
+        <w:t>lhd</w:t>
+      </w:r>
+      <w:proofErr w:type="spellEnd"/>
+      <w:r>
+        <w:t>). Perdiendo todas las unidades aliadas.</w:t>
+      </w:r>
+    </w:p>
+    <w:p/>
+    <w:p>
+      <w:pPr>
+        <w:rPr>
+          <w:color w:val="0070C0"/>
+        </w:rPr>
+      </w:pPr>
+      <w:r>
+        <w:rPr>
+          <w:color w:val="0070C0"/>
+        </w:rPr>
         <w:lastRenderedPageBreak/>
-        <w:t>Como se pierde: Eliminando muchos civiles o unidades neutrales. Perdiendo la nave de comando de la flota (</w:t>
+        <w:t>MISIÓN #</w:t>
+      </w:r>
+      <w:r>
+        <w:rPr>
+          <w:color w:val="0070C0"/>
+        </w:rPr>
+        <w:t>10</w:t>
+      </w:r>
+      <w:r>
+        <w:rPr>
+          <w:color w:val="0070C0"/>
+        </w:rPr>
+        <w:t xml:space="preserve">: </w:t>
+      </w:r>
+    </w:p>
+    <w:p>
+      <w:r>
+        <w:t xml:space="preserve">IDEA CENTRAL: </w:t>
+      </w:r>
+      <w:r>
+        <w:t>La previa a la entrada a la ciudad. Se deben destruir las fortificaciones defensivas en las afueras de la ciudad. Mientras las unidades aliadas avanzan deberán ser protegidas del fuego de artillería y los bombardeos aéreos.</w:t>
+      </w:r>
+    </w:p>
+    <w:p>
+      <w:r>
+        <w:t>Situación: En las puertas de la ciudad, las tropas del bando enemigo se atrincheran para evitar el ingreso de los aliados a la capital. Los ataques de artillería y las patrullas aéreas enemigas complican el avance.</w:t>
+      </w:r>
+    </w:p>
+    <w:p>
+      <w:r>
+        <w:t xml:space="preserve">Objetivo: Destruir las barricadas y puestos de control enemigo que bloquean el acceso a la ciudad. </w:t>
+      </w:r>
+      <w:r>
+        <w:t>Proteger las unidades aliadas que ingresan a la ciudad.</w:t>
+      </w:r>
+    </w:p>
+    <w:p>
+      <w:r>
+        <w:t>Lo nuevo: Yo que se…</w:t>
+      </w:r>
+    </w:p>
+    <w:p>
+      <w:r>
+        <w:t xml:space="preserve">Como se pierde: </w:t>
+      </w:r>
+      <w:r>
+        <w:t>Perdiendo la nave de comando de la flota (</w:t>
       </w:r>
       <w:proofErr w:type="spellStart"/>
       <w:r>
@@ -915,8 +1008,85 @@
       </w:r>
       <w:proofErr w:type="spellEnd"/>
       <w:r>
-        <w:t>). Perdiendo todas las unidades aliadas.</w:t>
-      </w:r>
+        <w:t>). Sufriendo excesivas perdidas de las unidades aliadas.</w:t>
+      </w:r>
+    </w:p>
+    <w:p>
+      <w:pPr>
+        <w:rPr>
+          <w:color w:val="0070C0"/>
+        </w:rPr>
+      </w:pPr>
+      <w:r>
+        <w:rPr>
+          <w:color w:val="0070C0"/>
+        </w:rPr>
+        <w:t>MISIÓN #</w:t>
+      </w:r>
+      <w:r>
+        <w:rPr>
+          <w:color w:val="0070C0"/>
+        </w:rPr>
+        <w:t>09</w:t>
+      </w:r>
+      <w:r>
+        <w:rPr>
+          <w:color w:val="0070C0"/>
+        </w:rPr>
+        <w:t xml:space="preserve">: </w:t>
+      </w:r>
+    </w:p>
+    <w:p>
+      <w:r>
+        <w:t>IDEA CENTRAL:</w:t>
+      </w:r>
+      <w:r>
+        <w:t xml:space="preserve"> </w:t>
+      </w:r>
+      <w:r>
+        <w:t>Destruir cuartel general enemigo para diezmar la fuerza militar enemiga, reducir su fuerza defensiva y cortar cadenas de mandos previo a la invasión final.</w:t>
+      </w:r>
+    </w:p>
+    <w:p>
+      <w:r>
+        <w:t>Situación: A punto de iniciar la escalada final, es necesario eliminar la cadena de mando enemiga, y reducir la fuera militar enemiga en la zona para prevenir refuerzos enemigos cercanos.</w:t>
+      </w:r>
+    </w:p>
+    <w:p>
+      <w:r>
+        <w:t>Objetivo: asaltar la base militar enemiga, capturar cuartel general y asegurar la zona.</w:t>
+      </w:r>
+    </w:p>
+    <w:p>
+      <w:r>
+        <w:t xml:space="preserve">Como se pierde: </w:t>
+      </w:r>
+      <w:r>
+        <w:t>Perdiendo la nave de comando de la flota (</w:t>
+      </w:r>
+      <w:proofErr w:type="spellStart"/>
+      <w:r>
+        <w:t>lhd</w:t>
+      </w:r>
+      <w:proofErr w:type="spellEnd"/>
+      <w:r>
+        <w:t xml:space="preserve">). </w:t>
+      </w:r>
+      <w:proofErr w:type="spellStart"/>
+      <w:r>
+        <w:t>Perdiend</w:t>
+      </w:r>
+      <w:proofErr w:type="spellEnd"/>
+      <w:r>
+        <w:t xml:space="preserve"> todas las unidades del jugador.</w:t>
+      </w:r>
+    </w:p>
+    <w:p>
+      <w:pPr>
+        <w:rPr>
+          <w:color w:val="0070C0"/>
+        </w:rPr>
+      </w:pPr>
     </w:p>
     <w:p/>
     <w:p>
@@ -935,7 +1105,7 @@
         <w:rPr>
           <w:color w:val="0070C0"/>
         </w:rPr>
-        <w:t>09</w:t>
+        <w:t>08</w:t>
       </w:r>
       <w:r>
         <w:rPr>
@@ -945,151 +1115,6 @@
       </w:r>
     </w:p>
     <w:p>
-      <w:r>
-        <w:t xml:space="preserve">IDEA CENTRAL: </w:t>
-      </w:r>
-      <w:r>
-        <w:t>La previa a la entrada a la ciudad. Se deben destruir las fortificaciones defensivas en las afueras de la ciudad. Mientras las unidades aliadas avanzan deberán ser protegidas del fuego de artillería y los bombardeos aéreos.</w:t>
-      </w:r>
-    </w:p>
-    <w:p>
-      <w:r>
-        <w:t>Situación: En las puertas de la ciudad, las tropas del bando enemigo se atrincheran para evitar el ingreso de los aliados a la capital. Los ataques de artillería y las patrullas aéreas enemigas complican el avance.</w:t>
-      </w:r>
-    </w:p>
-    <w:p>
-      <w:r>
-        <w:t xml:space="preserve">Objetivo: Destruir las barricadas y puestos de control enemigo que bloquean el acceso a la ciudad. </w:t>
-      </w:r>
-      <w:r>
-        <w:t>Proteger las unidades aliadas que ingresan a la ciudad.</w:t>
-      </w:r>
-    </w:p>
-    <w:p>
-      <w:r>
-        <w:t>Lo nuevo: Yo que se…</w:t>
-      </w:r>
-    </w:p>
-    <w:p>
-      <w:r>
-        <w:t xml:space="preserve">Como se pierde: </w:t>
-      </w:r>
-      <w:r>
-        <w:t>Perdiendo la nave de comando de la flota (</w:t>
-      </w:r>
-      <w:proofErr w:type="spellStart"/>
-      <w:r>
-        <w:t>lhd</w:t>
-      </w:r>
-      <w:proofErr w:type="spellEnd"/>
-      <w:r>
-        <w:t>). Sufriendo excesivas perdidas de las unidades aliadas.</w:t>
-      </w:r>
-    </w:p>
-    <w:p>
-      <w:pPr>
-        <w:rPr>
-          <w:color w:val="0070C0"/>
-        </w:rPr>
-      </w:pPr>
-      <w:r>
-        <w:rPr>
-          <w:color w:val="0070C0"/>
-        </w:rPr>
-        <w:t>MISIÓN #</w:t>
-      </w:r>
-      <w:r>
-        <w:rPr>
-          <w:color w:val="0070C0"/>
-        </w:rPr>
-        <w:t>08</w:t>
-      </w:r>
-      <w:r>
-        <w:rPr>
-          <w:color w:val="0070C0"/>
-        </w:rPr>
-        <w:t xml:space="preserve">: </w:t>
-      </w:r>
-    </w:p>
-    <w:p>
-      <w:r>
-        <w:t>IDEA CENTRAL:</w:t>
-      </w:r>
-      <w:r>
-        <w:t xml:space="preserve"> </w:t>
-      </w:r>
-      <w:r>
-        <w:t>Destruir cuartel general enemigo para diezmar la fuerza militar enemiga, reducir su fuerza defensiva y cortar cadenas de mandos previo a la invasión final.</w:t>
-      </w:r>
-    </w:p>
-    <w:p>
-      <w:r>
-        <w:t>Situación: A punto de iniciar la escalada final, es necesario eliminar la cadena de mando enemiga, y reducir la fuera militar enemiga en la zona para prevenir refuerzos enemigos cercanos.</w:t>
-      </w:r>
-    </w:p>
-    <w:p>
-      <w:r>
-        <w:t>Objetivo: asaltar la base militar enemiga, capturar cuartel general y asegurar la zona.</w:t>
-      </w:r>
-    </w:p>
-    <w:p>
-      <w:r>
-        <w:t xml:space="preserve">Como se pierde: </w:t>
-      </w:r>
-      <w:r>
-        <w:t>Perdiendo la nave de comando de la flota (</w:t>
-      </w:r>
-      <w:proofErr w:type="spellStart"/>
-      <w:r>
-        <w:t>lhd</w:t>
-      </w:r>
-      <w:proofErr w:type="spellEnd"/>
-      <w:r>
-        <w:t xml:space="preserve">). </w:t>
-      </w:r>
-      <w:proofErr w:type="spellStart"/>
-      <w:r>
-        <w:t>Perdiend</w:t>
-      </w:r>
-      <w:proofErr w:type="spellEnd"/>
-      <w:r>
-        <w:t xml:space="preserve"> todas las unidades del jugador.</w:t>
-      </w:r>
-    </w:p>
-    <w:p>
-      <w:pPr>
-        <w:rPr>
-          <w:color w:val="0070C0"/>
-        </w:rPr>
-      </w:pPr>
-    </w:p>
-    <w:p/>
-    <w:p>
-      <w:pPr>
-        <w:rPr>
-          <w:color w:val="0070C0"/>
-        </w:rPr>
-      </w:pPr>
-      <w:r>
-        <w:rPr>
-          <w:color w:val="0070C0"/>
-        </w:rPr>
-        <w:t>MISIÓN #</w:t>
-      </w:r>
-      <w:r>
-        <w:rPr>
-          <w:color w:val="0070C0"/>
-        </w:rPr>
-        <w:t>07</w:t>
-      </w:r>
-      <w:r>
-        <w:rPr>
-          <w:color w:val="0070C0"/>
-        </w:rPr>
-        <w:t xml:space="preserve">: </w:t>
-      </w:r>
-    </w:p>
-    <w:p>
       <w:pPr>
         <w:rPr>
           <w:color w:val="0070C0"/>
@@ -1104,7 +1129,6 @@
     </w:p>
     <w:p>
       <w:r>
-        <w:lastRenderedPageBreak/>
         <w:t>IDEA</w:t>
       </w:r>
       <w:r>
@@ -1117,173 +1141,6 @@
       <w:proofErr w:type="spellEnd"/>
       <w:r>
         <w:t>.</w:t>
-      </w:r>
-    </w:p>
-    <w:p>
-      <w:r>
-        <w:t xml:space="preserve">Situación: </w:t>
-      </w:r>
-      <w:r>
-        <w:t>Las tropas aliadas han logrado capturar uno o más puentes, refuerzos enemigos vienen en camino para aislar y reducir las tropas aliadas debilitadas por el combate anterior.</w:t>
-      </w:r>
-    </w:p>
-    <w:p>
-      <w:r>
-        <w:t xml:space="preserve">Objetivo: Mantener y defender los puentes restantes mientras llegan refuerzos aliados. </w:t>
-      </w:r>
-    </w:p>
-    <w:p>
-      <w:r>
-        <w:t>Lo nuevo: …</w:t>
-      </w:r>
-    </w:p>
-    <w:p>
-      <w:r>
-        <w:t>Como se pierde: Perdiendo la nave de comando de la flota (</w:t>
-      </w:r>
-      <w:proofErr w:type="spellStart"/>
-      <w:r>
-        <w:t>lhd</w:t>
-      </w:r>
-      <w:proofErr w:type="spellEnd"/>
-      <w:r>
-        <w:t>). Perdiendo todas las unidades aliadas y del jugador antes que lleguen los refuerzos.</w:t>
-      </w:r>
-    </w:p>
-    <w:p>
-      <w:pPr>
-        <w:rPr>
-          <w:color w:val="0070C0"/>
-        </w:rPr>
-      </w:pPr>
-      <w:r>
-        <w:rPr>
-          <w:color w:val="0070C0"/>
-        </w:rPr>
-        <w:t xml:space="preserve">(idea 2) </w:t>
-      </w:r>
-      <w:r>
-        <w:rPr>
-          <w:color w:val="0070C0"/>
-        </w:rPr>
-        <w:t>PARTE 1:</w:t>
-      </w:r>
-    </w:p>
-    <w:p>
-      <w:r>
-        <w:t>IDEA</w:t>
-      </w:r>
-      <w:r>
-        <w:t xml:space="preserve"> CENTRAL: </w:t>
-      </w:r>
-      <w:r>
-        <w:t xml:space="preserve">Tomar los puentes de acceso que conectan la autopista hacia la capital. Evitar que </w:t>
-      </w:r>
-      <w:r>
-        <w:t>los puentes sean autodestruidos y destruir líneas de abastecimiento.</w:t>
-      </w:r>
-    </w:p>
-    <w:p>
-      <w:r>
-        <w:t xml:space="preserve">Situación: </w:t>
-      </w:r>
-      <w:r>
-        <w:t>En un esfuerzo conjunto, las tropas aliadas junto con el jugador realizarán la acometida final para retomar la capital de las fuerzas enemigas. El comienzo de la operación requiere capturar y asegurar los puentes de acceso a la autopista que conecta la ciudad, para movilizar las tropas y los refuerzos desde la costa.</w:t>
-      </w:r>
-    </w:p>
-    <w:p>
-      <w:r>
-        <w:t>Objetivo: capturar y defender los puentes sobre los ríos para obtener una línea de comunicación con la capital</w:t>
-      </w:r>
-      <w:r>
-        <w:t>. Destruir rutas secundarias y vías de suministro enemigas.</w:t>
-      </w:r>
-    </w:p>
-    <w:p>
-      <w:r>
-        <w:t xml:space="preserve">Lo nuevo: </w:t>
-      </w:r>
-      <w:r>
-        <w:t>cómo</w:t>
-      </w:r>
-      <w:r>
-        <w:t xml:space="preserve"> voy a saber, si no hay progresión, ni unidades, ni mecánicas, ni nada.</w:t>
-      </w:r>
-    </w:p>
-    <w:p>
-      <w:r>
-        <w:t>Como se pierde:</w:t>
-      </w:r>
-      <w:r>
-        <w:t xml:space="preserve"> Todos los puentes son destruidos</w:t>
-      </w:r>
-      <w:r>
-        <w:t>, evitando que las tropas aliadas se movilicen a tiempo</w:t>
-      </w:r>
-      <w:r>
-        <w:t>. Perdiendo la nave de comando de la flota (</w:t>
-      </w:r>
-      <w:proofErr w:type="spellStart"/>
-      <w:r>
-        <w:t>lhd</w:t>
-      </w:r>
-      <w:proofErr w:type="spellEnd"/>
-      <w:r>
-        <w:t>).</w:t>
-      </w:r>
-    </w:p>
-    <w:p/>
-    <w:p>
-      <w:r>
-        <w:rPr>
-          <w:color w:val="0070C0"/>
-        </w:rPr>
-        <w:t xml:space="preserve">Misión </w:t>
-      </w:r>
-      <w:r>
-        <w:rPr>
-          <w:color w:val="0070C0"/>
-        </w:rPr>
-        <w:t>#</w:t>
-      </w:r>
-      <w:r>
-        <w:rPr>
-          <w:color w:val="0070C0"/>
-        </w:rPr>
-        <w:t>06</w:t>
-      </w:r>
-      <w:r>
-        <w:rPr>
-          <w:color w:val="0070C0"/>
-        </w:rPr>
-        <w:t>:</w:t>
-      </w:r>
-      <w:r>
-        <w:t xml:space="preserve"> </w:t>
-      </w:r>
-    </w:p>
-    <w:p>
-      <w:pPr>
-        <w:rPr>
-          <w:color w:val="0070C0"/>
-        </w:rPr>
-      </w:pPr>
-      <w:r>
-        <w:rPr>
-          <w:color w:val="0070C0"/>
-        </w:rPr>
-        <w:t>PARTE 2:</w:t>
-      </w:r>
-    </w:p>
-    <w:p>
-      <w:r>
-        <w:t xml:space="preserve">IDEA CENTRAL: </w:t>
-      </w:r>
-      <w:r>
-        <w:t>Con las defensas mermadas</w:t>
-      </w:r>
-      <w:r>
-        <w:t>, las tropas aliadas pueden comenzar el desembarco en la costa para recuperar la capital aliada.</w:t>
       </w:r>
     </w:p>
     <w:p>
@@ -1292,6 +1149,252 @@
         <w:t xml:space="preserve">Situación: </w:t>
       </w:r>
       <w:r>
+        <w:t>Las tropas aliadas han logrado capturar uno o más puentes, refuerzos enemigos vienen en camino para aislar y reducir las tropas aliadas debilitadas por el combate anterior.</w:t>
+      </w:r>
+    </w:p>
+    <w:p>
+      <w:r>
+        <w:t xml:space="preserve">Objetivo: Mantener y defender los puentes restantes mientras llegan refuerzos aliados. </w:t>
+      </w:r>
+    </w:p>
+    <w:p>
+      <w:r>
+        <w:t>Lo nuevo: …</w:t>
+      </w:r>
+    </w:p>
+    <w:p>
+      <w:r>
+        <w:t>Como se pierde: Perdiendo la nave de comando de la flota (</w:t>
+      </w:r>
+      <w:proofErr w:type="spellStart"/>
+      <w:r>
+        <w:t>lhd</w:t>
+      </w:r>
+      <w:proofErr w:type="spellEnd"/>
+      <w:r>
+        <w:t>). Perdiendo todas las unidades aliadas y del jugador antes que lleguen los refuerzos.</w:t>
+      </w:r>
+    </w:p>
+    <w:p>
+      <w:pPr>
+        <w:rPr>
+          <w:color w:val="0070C0"/>
+        </w:rPr>
+      </w:pPr>
+      <w:r>
+        <w:rPr>
+          <w:color w:val="0070C0"/>
+        </w:rPr>
+        <w:t xml:space="preserve">(idea 2) </w:t>
+      </w:r>
+      <w:r>
+        <w:rPr>
+          <w:color w:val="0070C0"/>
+        </w:rPr>
+        <w:t>PARTE 1:</w:t>
+      </w:r>
+    </w:p>
+    <w:p>
+      <w:r>
+        <w:t>IDEA</w:t>
+      </w:r>
+      <w:r>
+        <w:t xml:space="preserve"> CENTRAL: </w:t>
+      </w:r>
+      <w:r>
+        <w:t xml:space="preserve">Tomar los puentes de acceso que conectan la autopista hacia la capital. Evitar que </w:t>
+      </w:r>
+      <w:r>
+        <w:t>los puentes sean autodestruidos y destruir líneas de abastecimiento.</w:t>
+      </w:r>
+    </w:p>
+    <w:p>
+      <w:r>
+        <w:t xml:space="preserve">Situación: </w:t>
+      </w:r>
+      <w:r>
+        <w:t>En un esfuerzo conjunto, las tropas aliadas junto con el jugador realizarán la acometida final para retomar la capital de las fuerzas enemigas. El comienzo de la operación requiere capturar y asegurar los puentes de acceso a la autopista que conecta la ciudad, para movilizar las tropas y los refuerzos desde la costa.</w:t>
+      </w:r>
+    </w:p>
+    <w:p>
+      <w:r>
+        <w:t>Objetivo: capturar y defender los puentes sobre los ríos para obtener una línea de comunicación con la capital</w:t>
+      </w:r>
+      <w:r>
+        <w:t>. Destruir rutas secundarias y vías de suministro enemigas.</w:t>
+      </w:r>
+    </w:p>
+    <w:p>
+      <w:r>
+        <w:t xml:space="preserve">Lo nuevo: </w:t>
+      </w:r>
+      <w:r>
+        <w:t>cómo</w:t>
+      </w:r>
+      <w:r>
+        <w:t xml:space="preserve"> voy a saber, si no hay progresión, ni unidades, ni mecánicas, ni nada.</w:t>
+      </w:r>
+    </w:p>
+    <w:p>
+      <w:r>
+        <w:t>Como se pierde:</w:t>
+      </w:r>
+      <w:r>
+        <w:t xml:space="preserve"> Todos los puentes son destruidos</w:t>
+      </w:r>
+      <w:r>
+        <w:t>, evitando que las tropas aliadas se movilicen a tiempo</w:t>
+      </w:r>
+      <w:r>
+        <w:t>. Perdiendo la nave de comando de la flota (</w:t>
+      </w:r>
+      <w:proofErr w:type="spellStart"/>
+      <w:r>
+        <w:t>lhd</w:t>
+      </w:r>
+      <w:proofErr w:type="spellEnd"/>
+      <w:r>
+        <w:t>).</w:t>
+      </w:r>
+    </w:p>
+    <w:p/>
+    <w:p>
+      <w:pPr>
+        <w:rPr>
+          <w:color w:val="0070C0"/>
+        </w:rPr>
+      </w:pPr>
+      <w:r>
+        <w:rPr>
+          <w:color w:val="0070C0"/>
+        </w:rPr>
+        <w:t>MISIÓN #</w:t>
+      </w:r>
+      <w:r>
+        <w:rPr>
+          <w:color w:val="0070C0"/>
+        </w:rPr>
+        <w:t>7</w:t>
+      </w:r>
+      <w:r>
+        <w:rPr>
+          <w:color w:val="0070C0"/>
+        </w:rPr>
+        <w:t>:</w:t>
+      </w:r>
+    </w:p>
+    <w:p>
+      <w:r>
+        <w:t xml:space="preserve">IDEA CENTRAL: La flota aliada moviliza su portaaviones </w:t>
+      </w:r>
+      <w:proofErr w:type="spellStart"/>
+      <w:r>
+        <w:t>mas</w:t>
+      </w:r>
+      <w:proofErr w:type="spellEnd"/>
+      <w:r>
+        <w:t xml:space="preserve"> importante para liderar la ofensiva, cuando es sorprendido por un submarino enemigo que logra asestarle un golpe con un torpedo en la popa del barco, dejándolo muerto en el agua.</w:t>
+      </w:r>
+    </w:p>
+    <w:p>
+      <w:r>
+        <w:t xml:space="preserve">Situación: La flota se moviliza, un submarino enemigo encuentra la fuerza de ataque del portaaviones aliado y aprovecha para atacar al portaaviones, impactándolo y causando que pierda potencia. Uno de los destructores del grupo de batalla del portaaviones sale a la caza del submarino, pero es impactado </w:t>
+      </w:r>
+      <w:r>
+        <w:lastRenderedPageBreak/>
+        <w:t xml:space="preserve">múltiples veces resultando hundido. La flota entiende que no es un único submarino, </w:t>
+      </w:r>
+      <w:proofErr w:type="spellStart"/>
+      <w:r>
+        <w:t>si no</w:t>
+      </w:r>
+      <w:proofErr w:type="spellEnd"/>
+      <w:r>
+        <w:t xml:space="preserve"> una manada de lobos. </w:t>
+      </w:r>
+    </w:p>
+    <w:p>
+      <w:r>
+        <w:t>Objetivo: Cazar los submarinos enemigos. Evitar que el portaaviones sea hundido. Brindar cobertura a las unidades aliadas que apoyan el rescate en el destructor siniestrado. Sobrevivir.</w:t>
+      </w:r>
+    </w:p>
+    <w:p>
+      <w:r>
+        <w:t>Lo nuevo: El jugador deberá usar sonar y torpedos desde destructores y helicópteros de la flota.</w:t>
+      </w:r>
+    </w:p>
+    <w:p>
+      <w:r>
+        <w:t>Como se pierde: Perdida total del portaaviones aliado. Perdiendo la nave de comando de la flota (</w:t>
+      </w:r>
+      <w:proofErr w:type="spellStart"/>
+      <w:r>
+        <w:t>lhd</w:t>
+      </w:r>
+      <w:proofErr w:type="spellEnd"/>
+      <w:r>
+        <w:t>).</w:t>
+      </w:r>
+    </w:p>
+    <w:p/>
+    <w:p>
+      <w:r>
+        <w:rPr>
+          <w:color w:val="0070C0"/>
+        </w:rPr>
+        <w:t xml:space="preserve">Misión </w:t>
+      </w:r>
+      <w:r>
+        <w:rPr>
+          <w:color w:val="0070C0"/>
+        </w:rPr>
+        <w:t>#</w:t>
+      </w:r>
+      <w:r>
+        <w:rPr>
+          <w:color w:val="0070C0"/>
+        </w:rPr>
+        <w:t>06</w:t>
+      </w:r>
+      <w:r>
+        <w:rPr>
+          <w:color w:val="0070C0"/>
+        </w:rPr>
+        <w:t>:</w:t>
+      </w:r>
+      <w:r>
+        <w:t xml:space="preserve"> </w:t>
+      </w:r>
+    </w:p>
+    <w:p>
+      <w:pPr>
+        <w:rPr>
+          <w:color w:val="0070C0"/>
+        </w:rPr>
+      </w:pPr>
+      <w:r>
+        <w:rPr>
+          <w:color w:val="0070C0"/>
+        </w:rPr>
+        <w:t>PARTE 2:</w:t>
+      </w:r>
+    </w:p>
+    <w:p>
+      <w:r>
+        <w:t xml:space="preserve">IDEA CENTRAL: </w:t>
+      </w:r>
+      <w:r>
+        <w:t>Con las defensas mermadas</w:t>
+      </w:r>
+      <w:r>
+        <w:t>, las tropas aliadas pueden comenzar el desembarco en la costa para recuperar la capital aliada.</w:t>
+      </w:r>
+    </w:p>
+    <w:p>
+      <w:r>
+        <w:t xml:space="preserve">Situación: </w:t>
+      </w:r>
+      <w:r>
         <w:t>Luz verde para</w:t>
       </w:r>
       <w:r>
@@ -1314,6 +1417,11 @@
     </w:p>
     <w:p>
       <w:r>
+        <w:t>Lo nuevo: GRAN Asalto anfibio aliado desde la flota aliada.</w:t>
+      </w:r>
+    </w:p>
+    <w:p>
+      <w:r>
         <w:t>Como se pierde: Perdiendo la nave de comando de la flota (</w:t>
       </w:r>
       <w:proofErr w:type="spellStart"/>
@@ -1361,6 +1469,20 @@
     </w:p>
     <w:p>
       <w:r>
+        <w:lastRenderedPageBreak/>
+        <w:t xml:space="preserve">Lo nuevo: Despliegue de bombarderos y aviones desde la base aliada capturada en la isla. (talvez controlables dándoles ordenes, o solo protegiéndolos con nuestros </w:t>
+      </w:r>
+      <w:proofErr w:type="spellStart"/>
+      <w:r>
+        <w:t>harriers</w:t>
+      </w:r>
+      <w:proofErr w:type="spellEnd"/>
+      <w:r>
+        <w:t xml:space="preserve"> si ya disponibles, o desde el portaaviones aliado con sus cazas)</w:t>
+      </w:r>
+    </w:p>
+    <w:p>
+      <w:r>
         <w:t>Como se pierde: Perdiendo la nave de comando de la flota (</w:t>
       </w:r>
       <w:proofErr w:type="spellStart"/>
@@ -1445,10 +1567,45 @@
       <w:r>
         <w:t xml:space="preserve">Ciudad central está a tiro, pero no se puede realizar ninguna operación militar cercana debido a la presencia de aeronaves y buques enemigos en la costa. </w:t>
       </w:r>
-    </w:p>
-    <w:p>
-      <w:r>
-        <w:t>Objetivo: Limpiar las defensas aéreas y costeras de la base naval. Bombardear unidades defensivas enemigas, asegurar el puerto, asaltar y tomar el aeródromo de la isla.</w:t>
+      <w:r>
+        <w:t>Ya fuimos testigos de su capacidad aérea en la misión pasada.</w:t>
+      </w:r>
+    </w:p>
+    <w:p>
+      <w:r>
+        <w:t>Objetivo: Limpiar las defensas aéreas y costeras de la base naval. Bombardear unidades defensivas enemigas, asegurar el puerto, asaltar y tomar el aeródromo de la isla</w:t>
+      </w:r>
+      <w:r>
+        <w:t xml:space="preserve"> para evitar más ataques desde el mar</w:t>
+      </w:r>
+      <w:r>
+        <w:t>.</w:t>
+      </w:r>
+    </w:p>
+    <w:p>
+      <w:r>
+        <w:t>Lo nuevo: unidades aliadas controlables (aviones)</w:t>
+      </w:r>
+      <w:r>
+        <w:t>, submarinos enemigos.</w:t>
+      </w:r>
+    </w:p>
+    <w:p>
+      <w:pPr>
+        <w:pStyle w:val="Prrafodelista"/>
+        <w:numPr>
+          <w:ilvl w:val="0"/>
+          <w:numId w:val="6"/>
+        </w:numPr>
+        <w:rPr>
+          <w:color w:val="00B050"/>
+        </w:rPr>
+      </w:pPr>
+      <w:r>
+        <w:rPr>
+          <w:color w:val="00B050"/>
+        </w:rPr>
+        <w:t>En esta misión recibimos apoyo del portaaviones aliado.</w:t>
       </w:r>
     </w:p>
     <w:p>
@@ -1464,67 +1621,108 @@
         <w:t>). Perdiendo todas las unidades del jugador.</w:t>
       </w:r>
     </w:p>
-    <w:p>
-      <w:pPr>
-        <w:rPr>
-          <w:color w:val="0070C0"/>
-        </w:rPr>
-      </w:pPr>
-      <w:r>
-        <w:rPr>
-          <w:color w:val="0070C0"/>
-        </w:rPr>
+    <w:p/>
+    <w:p>
+      <w:pPr>
+        <w:rPr>
+          <w:color w:val="0070C0"/>
+        </w:rPr>
+      </w:pPr>
+      <w:r>
+        <w:rPr>
+          <w:color w:val="0070C0"/>
+        </w:rPr>
+        <w:t>MISIÓN #4</w:t>
+      </w:r>
+      <w:r>
+        <w:rPr>
+          <w:color w:val="0070C0"/>
+        </w:rPr>
+        <w:t xml:space="preserve">: </w:t>
+      </w:r>
+    </w:p>
+    <w:p>
+      <w:r>
+        <w:t>IDEA CENTRAL:</w:t>
+      </w:r>
+      <w:r>
+        <w:t xml:space="preserve"> </w:t>
+      </w:r>
+      <w:r>
+        <w:t xml:space="preserve">HQ nos ordena atacar las líneas ferroviarias, </w:t>
+      </w:r>
+      <w:r>
+        <w:t xml:space="preserve">estación de carga y almacenes de la zona costera </w:t>
+      </w:r>
+      <w:r>
+        <w:t xml:space="preserve">del país, con el fin de afectar las líneas de suministros. </w:t>
+      </w:r>
+      <w:r>
+        <w:t xml:space="preserve">Durante la ofensiva, somos atacados por una intensa horda de aviones enemigos, provenientes del mar, y deberemos defendernos con lo que tengamos mientras realizamos la operación. </w:t>
+      </w:r>
+    </w:p>
+    <w:p>
+      <w:r>
+        <w:t xml:space="preserve">Situación: Las tropas aliadas en tierra comienzan a reagruparse desde el sur, nuestra tarea es destruir </w:t>
+      </w:r>
+      <w:r>
+        <w:t>la infraestructura logística de</w:t>
+      </w:r>
+      <w:r>
+        <w:t xml:space="preserve"> </w:t>
+      </w:r>
+      <w:r>
+        <w:t>la zona costera</w:t>
+      </w:r>
+      <w:r>
+        <w:t xml:space="preserve"> del país con el fin de cortar las líneas de sumin</w:t>
+      </w:r>
+      <w:r>
+        <w:t>istro capturadas por el enemigo. De esta manera no es necesario combatir contra todos los focos rebeldes, cortando las líneas de suministro afecta la ofensiva del país aliado, pero con la ofensiva aliada en camino, los suministros vendrán por otras vías.</w:t>
+      </w:r>
+    </w:p>
+    <w:p>
+      <w:r>
         <w:lastRenderedPageBreak/>
-        <w:t>MISIÓN #</w:t>
-      </w:r>
-      <w:r>
-        <w:rPr>
-          <w:color w:val="0070C0"/>
-        </w:rPr>
-        <w:t>4</w:t>
-      </w:r>
-      <w:r>
-        <w:rPr>
-          <w:color w:val="0070C0"/>
-        </w:rPr>
-        <w:t>:</w:t>
-      </w:r>
-      <w:r>
-        <w:rPr>
-          <w:color w:val="0070C0"/>
-        </w:rPr>
-        <w:t xml:space="preserve"> </w:t>
-      </w:r>
-    </w:p>
-    <w:p>
-      <w:r>
-        <w:t xml:space="preserve">IDEA CENTRAL: </w:t>
-      </w:r>
-      <w:r>
-        <w:t>La flota aliada moviliza su portaaviones mas importante para liderar la ofensiva, cuando es sorprendido por un submarino enemigo que logra asestarle un golpe con un torpedo en la popa del barco, dejándolo muerto en el agua.</w:t>
-      </w:r>
-    </w:p>
-    <w:p>
-      <w:r>
-        <w:t xml:space="preserve">Situación: La flota se moviliza, un submarino enemigo encuentra la fuerza de ataque del portaaviones aliado y aprovecha para atacar al portaaviones, impactándolo y causando que pierda potencia. Uno de los destructores del grupo de batalla del portaaviones sale a la caza del submarino, pero es impactado múltiples veces resultando hundido. La flota entiende que no es un único submarino, si no una manada de lobos. </w:t>
-      </w:r>
-    </w:p>
-    <w:p>
-      <w:r>
-        <w:t xml:space="preserve">Objetivo: </w:t>
-      </w:r>
-      <w:r>
-        <w:t>Cazar los submarinos enemigos. Evitar que el portaaviones sea hundido. Brindar cobertura a las unidades aliadas que apoyan el rescate en el destructor siniestrado. Sobrevivir.</w:t>
-      </w:r>
-    </w:p>
-    <w:p>
-      <w:r>
-        <w:t>Lo nuevo: El jugador deberá usar sonar y torpedos desde destructores y helicópteros de la flota.</w:t>
-      </w:r>
-    </w:p>
-    <w:p>
-      <w:r>
-        <w:t>Como se pierde: Perdida total del portaaviones aliado. Perdiendo la nave de comando de la flota (</w:t>
+        <w:t xml:space="preserve">Objetivo: Eliminar transportes, trenes y vías ferroviarias para prevenir su uso por parte del enemigo. </w:t>
+      </w:r>
+      <w:r>
+        <w:t xml:space="preserve">Destruir puentes y carretera de acceso a la zona de la terminal de carga. Capturar almacenes de carga (platita para el </w:t>
+      </w:r>
+      <w:proofErr w:type="spellStart"/>
+      <w:r>
+        <w:t>player</w:t>
+      </w:r>
+      <w:proofErr w:type="spellEnd"/>
+      <w:r>
+        <w:t xml:space="preserve"> e incluso acceso a unidades)</w:t>
+      </w:r>
+    </w:p>
+    <w:p>
+      <w:r>
+        <w:t xml:space="preserve">Lo nuevo: defensa antimisiles y </w:t>
+      </w:r>
+      <w:r>
+        <w:t>antiaérea</w:t>
+      </w:r>
+      <w:r>
+        <w:t xml:space="preserve"> de nuestros buques. Aviones enemigos. Ataque a tierra con artillería naval y misiles </w:t>
+      </w:r>
+      <w:proofErr w:type="spellStart"/>
+      <w:r>
+        <w:t>tomahawk</w:t>
+      </w:r>
+      <w:proofErr w:type="spellEnd"/>
+      <w:r>
+        <w:t xml:space="preserve"> o similares.</w:t>
+      </w:r>
+    </w:p>
+    <w:p>
+      <w:r>
+        <w:t xml:space="preserve">Como se pierde: </w:t>
+      </w:r>
+      <w:r>
+        <w:t>Perdiendo la nave de comando de la flota (</w:t>
       </w:r>
       <w:proofErr w:type="spellStart"/>
       <w:r>
@@ -1534,151 +1732,254 @@
       <w:r>
         <w:t>).</w:t>
       </w:r>
-    </w:p>
-    <w:p>
-      <w:pPr>
-        <w:rPr>
-          <w:color w:val="0070C0"/>
-        </w:rPr>
-      </w:pPr>
-    </w:p>
-    <w:p>
-      <w:pPr>
-        <w:rPr>
-          <w:color w:val="0070C0"/>
-        </w:rPr>
-      </w:pPr>
-      <w:r>
-        <w:rPr>
-          <w:color w:val="0070C0"/>
-        </w:rPr>
-        <w:t xml:space="preserve">MISIÓN #3: </w:t>
+      <w:r>
+        <w:t xml:space="preserve"> Destruyendo almacenes de suministros. Permitiendo que entren los refuerzos enemigos a la zona de la terminal de carga.</w:t>
+      </w:r>
+    </w:p>
+    <w:p/>
+    <w:p>
+      <w:pPr>
+        <w:rPr>
+          <w:color w:val="0070C0"/>
+        </w:rPr>
+      </w:pPr>
+      <w:r>
+        <w:rPr>
+          <w:color w:val="0070C0"/>
+        </w:rPr>
+        <w:t>MISIÓN #3</w:t>
+      </w:r>
+      <w:r>
+        <w:rPr>
+          <w:color w:val="0070C0"/>
+        </w:rPr>
+        <w:t xml:space="preserve">: </w:t>
       </w:r>
     </w:p>
     <w:p>
       <w:r>
         <w:t>IDEA CENTRAL:</w:t>
+      </w:r>
+      <w:r>
+        <w:t xml:space="preserve"> Descubrimos una de las líneas de suministros rebelde, a través de algunos comerciantes en un pueblo pesquero de la zona. Los piratas utilizan</w:t>
+      </w:r>
+      <w:r>
+        <w:t xml:space="preserve"> embarcaciones civiles para mover municiones y suministros a las tropas rebeldes.</w:t>
+      </w:r>
+    </w:p>
+    <w:p>
+      <w:r>
+        <w:t>Situación: Los rebeldes reciben parte de sus suministros por mar</w:t>
+      </w:r>
+      <w:r>
+        <w:t>. Se nos ordena asegurar el pueblo pesquero y desmantelar su operación. Se espera presencia enemiga y defensas costeras y aéreas moderadas.</w:t>
+      </w:r>
+    </w:p>
+    <w:p>
+      <w:r>
+        <w:t>Objetivo:</w:t>
+      </w:r>
+      <w:r>
+        <w:t xml:space="preserve"> Desmantelar la red de logística rebelde en la zona, deteniendo las embarcaciones contrabandistas y tomando control del pueblo costero. Apoyar a las tropas aliadas en la zona para que se unan a la contraofensiva.</w:t>
+      </w:r>
+    </w:p>
+    <w:p>
+      <w:r>
+        <w:t>Lo nuevo: cadenas de suministro enemigas, uso de radar para detección de objetivos.</w:t>
+      </w:r>
+      <w:r>
+        <w:t xml:space="preserve"> Defensas costeras.</w:t>
+      </w:r>
+    </w:p>
+    <w:p>
+      <w:r>
+        <w:t xml:space="preserve">Como se pierde: </w:t>
+      </w:r>
+      <w:r>
+        <w:t>Perdiendo la nave de comando de la flota (</w:t>
+      </w:r>
+      <w:proofErr w:type="spellStart"/>
+      <w:r>
+        <w:t>lhd</w:t>
+      </w:r>
+      <w:proofErr w:type="spellEnd"/>
+      <w:r>
+        <w:t>).</w:t>
+      </w:r>
+      <w:r>
+        <w:t xml:space="preserve"> Las fuerzas aliadas de la zona son eliminadas. Gran parte del cargamento enemigo es entregado.</w:t>
       </w:r>
     </w:p>
     <w:p/>
     <w:p/>
-    <w:p>
-      <w:pPr>
-        <w:rPr>
-          <w:color w:val="0070C0"/>
-        </w:rPr>
-      </w:pPr>
-      <w:r>
-        <w:rPr>
-          <w:color w:val="0070C0"/>
-        </w:rPr>
-        <w:t xml:space="preserve">Misión 1 — Evacuación. Sacar al personal de la embajada y a los extranjeros de una ciudad costera antes de que los rebeldes lleguen. Sólo helicópteros, sin oposición armada al principio. Real: Eastern Exit (Mogadiscio, 1991) y </w:t>
-      </w:r>
-      <w:proofErr w:type="spellStart"/>
-      <w:r>
-        <w:rPr>
-          <w:color w:val="0070C0"/>
-        </w:rPr>
-        <w:t>Assured</w:t>
-      </w:r>
-      <w:proofErr w:type="spellEnd"/>
-      <w:r>
-        <w:rPr>
-          <w:color w:val="0070C0"/>
-        </w:rPr>
-        <w:t xml:space="preserve"> Response (Liberia, 1996), las dos hechas desde buques anfibios exactamente como el tuyo.</w:t>
-      </w:r>
-    </w:p>
-    <w:p>
-      <w:pPr>
-        <w:rPr>
-          <w:color w:val="0070C0"/>
-        </w:rPr>
-      </w:pPr>
-      <w:r>
-        <w:rPr>
-          <w:color w:val="0070C0"/>
-        </w:rPr>
-        <w:t>Lo nuevo: desplegar, ir a un punto, embarcar gente y volver a bordo. Y aquí es donde plantas la regla de no dañar civiles, en su forma más blanda: hay multitud en la zona de aterrizaje. Eso te resuelve el agujero que tenías en la 10.</w:t>
-      </w:r>
-    </w:p>
-    <w:p>
-      <w:pPr>
-        <w:rPr>
-          <w:color w:val="0070C0"/>
-        </w:rPr>
-      </w:pPr>
-      <w:r>
-        <w:rPr>
-          <w:color w:val="0070C0"/>
-        </w:rPr>
-        <w:t>Se pierde: si la ciudad cae con gente dentro. Un reloj, no un enemigo.</w:t>
-      </w:r>
-    </w:p>
-    <w:p>
-      <w:pPr>
-        <w:rPr>
-          <w:color w:val="0070C0"/>
-        </w:rPr>
-      </w:pPr>
-    </w:p>
-    <w:p>
-      <w:pPr>
-        <w:rPr>
-          <w:color w:val="0070C0"/>
-        </w:rPr>
-      </w:pPr>
-      <w:r>
-        <w:rPr>
-          <w:color w:val="0070C0"/>
-        </w:rPr>
+    <w:p/>
+    <w:p>
+      <w:pPr>
+        <w:rPr>
+          <w:color w:val="0070C0"/>
+        </w:rPr>
+      </w:pPr>
+      <w:r>
+        <w:rPr>
+          <w:color w:val="0070C0"/>
+        </w:rPr>
+        <w:t>MISIÓN #2</w:t>
+      </w:r>
+      <w:r>
+        <w:rPr>
+          <w:color w:val="0070C0"/>
+        </w:rPr>
+        <w:t xml:space="preserve">: </w:t>
+      </w:r>
+    </w:p>
+    <w:p>
+      <w:r>
+        <w:t xml:space="preserve">IDEA CENTRAL: </w:t>
+      </w:r>
+      <w:r>
+        <w:t xml:space="preserve">El gobierno aliado </w:t>
+      </w:r>
+      <w:r>
+        <w:t>h</w:t>
+      </w:r>
+      <w:r>
+        <w:t xml:space="preserve">a caído, y los rebeldes toman de forma </w:t>
+      </w:r>
+      <w:r>
+        <w:t>ilegítima</w:t>
+      </w:r>
+      <w:r>
+        <w:t xml:space="preserve"> el poder. </w:t>
+      </w:r>
+      <w:r>
+        <w:t>El</w:t>
+      </w:r>
+      <w:r>
+        <w:t xml:space="preserve"> presidente aliado que fue rescatado junto con nuestros diplomáticos,</w:t>
+      </w:r>
+      <w:r>
+        <w:t xml:space="preserve"> pide apoyo a sus aliados, y juntos organizan una operación para </w:t>
+      </w:r>
+      <w:r>
         <w:lastRenderedPageBreak/>
-        <w:t>Misión 2 — Bloqueo naval. Impedir que lleguen armas a los rebeldes por mar. Interceptar e inspeccionar mercantes. Real: Sharp Guard en el Adriático.</w:t>
-      </w:r>
-    </w:p>
-    <w:p>
-      <w:pPr>
-        <w:rPr>
-          <w:color w:val="0070C0"/>
-        </w:rPr>
-      </w:pPr>
-      <w:r>
-        <w:rPr>
-          <w:color w:val="0070C0"/>
-        </w:rPr>
-        <w:t>Lo nuevo: identificar antes de disparar. Un pesquero y un carguero con armas se ven casi igual, y equivocarte cuesta. Es la misma lección de la 1 subida un escalón, y la que hace que la 10 no salga de la nada.</w:t>
-      </w:r>
-    </w:p>
-    <w:p>
-      <w:pPr>
-        <w:rPr>
-          <w:color w:val="0070C0"/>
-        </w:rPr>
-      </w:pPr>
-      <w:r>
-        <w:rPr>
-          <w:color w:val="0070C0"/>
-        </w:rPr>
-        <w:t>Se pierde: si pasan varios cargamentos.</w:t>
-      </w:r>
-    </w:p>
-    <w:p>
-      <w:pPr>
-        <w:rPr>
-          <w:color w:val="0070C0"/>
-        </w:rPr>
-      </w:pPr>
-    </w:p>
-    <w:p>
-      <w:pPr>
-        <w:rPr>
-          <w:color w:val="0070C0"/>
-        </w:rPr>
-      </w:pPr>
-      <w:r>
-        <w:rPr>
-          <w:color w:val="0070C0"/>
-        </w:rPr>
+        <w:t>retomar el control de la situación, replegar a los rebeldes, y capturar o ejecutar a su líder.</w:t>
+      </w:r>
+    </w:p>
+    <w:p>
+      <w:r>
+        <w:t>Situación: Se planifica una contraofensiva aliada, pero tomará tiempo a las tropas aliadas llegar al escenario del conflicto. Mientras tanto, algunos comandantes del ejecito aliado aún resisten, y se han puesto en contacto con nosotros para ayudar a capturar algunas zonas clave, y permitir al ejercito aliado reunir sus fuerzas repartidas por toda la zona, y poder comenzar su propia contraofensiva.</w:t>
+      </w:r>
+    </w:p>
+    <w:p>
+      <w:r>
+        <w:t>Objetivo:</w:t>
+      </w:r>
+      <w:r>
+        <w:t xml:space="preserve"> Rescatar parte del ejercito aliado que se encuentra aislado y sin suministros en la selva cercana.</w:t>
+      </w:r>
+    </w:p>
+    <w:p>
+      <w:r>
+        <w:t xml:space="preserve">Lo </w:t>
+      </w:r>
+      <w:proofErr w:type="gramStart"/>
+      <w:r>
+        <w:t>nuevo: ..</w:t>
+      </w:r>
+      <w:proofErr w:type="gramEnd"/>
+    </w:p>
+    <w:p>
+      <w:r>
+        <w:t>Como se pierde: La mayoría de las tropas aliadas son capturadas o eliminadas.</w:t>
+      </w:r>
+    </w:p>
+    <w:p>
+      <w:pPr>
+        <w:rPr>
+          <w:color w:val="0070C0"/>
+        </w:rPr>
+      </w:pPr>
+    </w:p>
+    <w:p>
+      <w:pPr>
+        <w:rPr>
+          <w:color w:val="0070C0"/>
+        </w:rPr>
+      </w:pPr>
+      <w:r>
+        <w:rPr>
+          <w:color w:val="0070C0"/>
+        </w:rPr>
+        <w:t>MISIÓN #1</w:t>
+      </w:r>
+      <w:r>
+        <w:rPr>
+          <w:color w:val="0070C0"/>
+        </w:rPr>
+        <w:t xml:space="preserve">: </w:t>
+      </w:r>
+    </w:p>
+    <w:p>
+      <w:pPr>
+        <w:rPr>
+          <w:color w:val="0070C0"/>
+        </w:rPr>
+      </w:pPr>
+      <w:proofErr w:type="gramStart"/>
+      <w:r>
+        <w:rPr>
+          <w:color w:val="0070C0"/>
+        </w:rPr>
+        <w:t>POSIBLE TIMING?</w:t>
+      </w:r>
+      <w:proofErr w:type="gramEnd"/>
+    </w:p>
+    <w:p>
+      <w:r>
+        <w:t>IDEA CENTRAL:</w:t>
+      </w:r>
+      <w:r>
+        <w:t xml:space="preserve"> Las fuerzas rebeldes han tomado la iniciativa, y han atacado las bases militares del gobierno central aliado, asaltado ciudades, y obligado al ejercito aliado a replegarse hasta la costa. Diplomáticos del bando del jugador, presentes en el país aliado junto con otros diplomáticos y miembros del gobierno aliado se han desplazado hasta las ciudades costeras. </w:t>
+      </w:r>
+    </w:p>
+    <w:p>
+      <w:r>
+        <w:t>Situación: Las tropas rebeldes atacan en todo el país, el ejército aliado tomado por sorpresa es obligado a replegarse. Con la iniciativa, el ejército rebelde logra acorralar y cercar al ejercito aliado en varios puntos. Diplomáticos del bando del jugador están atrapados en una ciudad aliada del sur cercana a la costa en espera de una extracción, y son protegidos únicamente por algunas tropas aliadas.</w:t>
+      </w:r>
+    </w:p>
+    <w:p>
+      <w:r>
+        <w:t xml:space="preserve">Objetivo: </w:t>
+      </w:r>
+      <w:r>
+        <w:t>Localizar donde se encuentran los diplomáticos, evacuar diplomáticos y representantes del gobierno aliado. No dañar civiles.</w:t>
+      </w:r>
+    </w:p>
+    <w:p>
+      <w:r>
+        <w:t>Como se pierde: Embajador del bando del jugador, o representantes del gobierno aliado son capturados o eliminados. Eliminando demasiados civiles.</w:t>
+      </w:r>
+    </w:p>
+    <w:p/>
+    <w:p/>
+    <w:p>
+      <w:pPr>
+        <w:rPr>
+          <w:color w:val="0070C0"/>
+        </w:rPr>
+      </w:pPr>
+    </w:p>
+    <w:p>
+      <w:pPr>
+        <w:rPr>
+          <w:color w:val="0070C0"/>
+        </w:rPr>
+      </w:pPr>
+      <w:r>
+        <w:rPr>
+          <w:color w:val="0070C0"/>
+        </w:rPr>
+        <w:lastRenderedPageBreak/>
         <w:t>Misión 3 — Primera sangre. Escoltando o patrullando, los rebeldes enseñan lo que de verdad tienen: una batería costera antibuque alcanza a una de tus escoltas. Real: HMS Sheffield (1982) y USS Stark (1987).</w:t>
       </w:r>
     </w:p>
@@ -1779,7 +2080,7 @@
 </file>
 
 <file path=word/numbering.xml><?xml version="1.0" encoding="utf-8"?>
-<w:numbering xmlns:wpc="http://schemas.microsoft.com/office/word/2010/wordprocessingCanvas" xmlns:cx="http://schemas.microsoft.com/office/drawing/2014/chartex" xmlns:cx1="http://schemas.microsoft.com/office/drawing/2015/9/8/chartex" xmlns:cx2="http://schemas.microsoft.com/office/drawing/2015/10/21/chartex" xmlns:cx3="http://schemas.microsoft.com/office/drawing/2016/5/9/chartex" xmlns:cx4="http://schemas.microsoft.com/office/drawing/2016/5/10/chartex" xmlns:cx5="http://schemas.microsoft.com/office/drawing/2016/5/11/chartex" xmlns:cx6="http://schemas.microsoft.com/office/drawing/2016/5/12/chartex" xmlns:cx7="http://schemas.microsoft.com/office/drawing/2016/5/13/chartex" xmlns:cx8="http://schemas.microsoft.com/office/drawing/2016/5/14/chartex" xmlns:mc="http://schemas.openxmlformats.org/markup-compatibility/2006" xmlns:aink="http://schemas.microsoft.com/office/drawing/2016/ink" xmlns:am3d="http://schemas.microsoft.com/office/drawing/2017/model3d" xmlns:o="urn:schemas-microsoft-com:office:office" xmlns:oel="http://schemas.microsoft.com/office/2019/extlst" xmlns:r="http://schemas.openxmlformats.org/officeDocument/2006/relationships" xmlns:m="http://schemas.openxmlformats.org/officeDocument/2006/math" xmlns:v="urn:schemas-microsoft-com:vml" xmlns:wp14="http://schemas.microsoft.com/office/word/2010/wordprocessingDrawing" xmlns:wp="http://schemas.openxmlformats.org/drawingml/2006/wordprocessingDrawing" xmlns:w10="urn:schemas-microsoft-com:office:word" xmlns:w="http://schemas.openxmlformats.org/wordprocessingml/2006/main" xmlns:w14="http://schemas.microsoft.com/office/word/2010/wordml" xmlns:w15="http://schemas.microsoft.com/office/word/2012/wordml" xmlns:w16cex="http://schemas.microsoft.com/office/word/2018/wordml/cex" xmlns:w16cid="http://schemas.microsoft.com/office/word/2016/wordml/cid" xmlns:w16="http://schemas.microsoft.com/office/word/2018/wordml" xmlns:w16du="http://schemas.microsoft.com/office/word/2023/wordml/word16du" xmlns:w16sdtdh="http://schemas.microsoft.com/office/word/2020/wordml/sdtdatahash" xmlns:w16sdtfl="http://schemas.microsoft.com/office/word/2024/wordml/sdtformatlock" xmlns:w16se="http://schemas.microsoft.com/office/word/2015/wordml/symex" xmlns:wpg="http://schemas.microsoft.com/office/word/2010/wordprocessingGroup" xmlns:wpi="http://schemas.microsoft.com/office/word/2010/wordprocessingInk" xmlns:wne="http://schemas.microsoft.com/office/word/2006/wordml" xmlns:wps="http://schemas.microsoft.com/office/word/2010/wordprocessingShape" mc:Ignorable="w14 w15 w16se w16cid w16 w16cex w16sdtdh w16sdtfl w16du wp14">
+<w:numbering xmlns:wpc="http://schemas.microsoft.com/office/word/2010/wordprocessingCanvas" xmlns:cx="http://schemas.microsoft.com/office/drawing/2014/chartex" xmlns:mc="http://schemas.openxmlformats.org/markup-compatibility/2006" xmlns:o="urn:schemas-microsoft-com:office:office" xmlns:r="http://schemas.openxmlformats.org/officeDocument/2006/relationships" xmlns:m="http://schemas.openxmlformats.org/officeDocument/2006/math" xmlns:v="urn:schemas-microsoft-com:vml" xmlns:wp14="http://schemas.microsoft.com/office/word/2010/wordprocessingDrawing" xmlns:wp="http://schemas.openxmlformats.org/drawingml/2006/wordprocessingDrawing" xmlns:w10="urn:schemas-microsoft-com:office:word" xmlns:w="http://schemas.openxmlformats.org/wordprocessingml/2006/main" xmlns:w14="http://schemas.microsoft.com/office/word/2010/wordml" xmlns:w15="http://schemas.microsoft.com/office/word/2012/wordml" xmlns:w16se="http://schemas.microsoft.com/office/word/2015/wordml/symex" xmlns:wpg="http://schemas.microsoft.com/office/word/2010/wordprocessingGroup" xmlns:wpi="http://schemas.microsoft.com/office/word/2010/wordprocessingInk" xmlns:wne="http://schemas.microsoft.com/office/word/2006/wordml" xmlns:wps="http://schemas.microsoft.com/office/word/2010/wordprocessingShape" mc:Ignorable="w14 w15 w16se wp14">
   <w:abstractNum w:abstractNumId="0" w15:restartNumberingAfterBreak="0">
     <w:nsid w:val="267473F3"/>
     <w:multiLevelType w:val="hybridMultilevel"/>
@@ -1870,6 +2171,118 @@
     </w:lvl>
   </w:abstractNum>
   <w:abstractNum w:abstractNumId="1" w15:restartNumberingAfterBreak="0">
+    <w:nsid w:val="5E496491"/>
+    <w:multiLevelType w:val="hybridMultilevel"/>
+    <w:tmpl w:val="9D2AF974"/>
+    <w:lvl w:ilvl="0" w:tplc="3B4C2C8E">
+      <w:numFmt w:val="bullet"/>
+      <w:lvlText w:val=""/>
+      <w:lvlJc w:val="left"/>
+      <w:pPr>
+        <w:ind w:left="720" w:hanging="360"/>
+      </w:pPr>
+      <w:rPr>
+        <w:rFonts w:ascii="Wingdings" w:eastAsiaTheme="minorHAnsi" w:hAnsi="Wingdings" w:cstheme="minorBidi" w:hint="default"/>
+      </w:rPr>
+    </w:lvl>
+    <w:lvl w:ilvl="1" w:tplc="04090003" w:tentative="1">
+      <w:start w:val="1"/>
+      <w:numFmt w:val="bullet"/>
+      <w:lvlText w:val="o"/>
+      <w:lvlJc w:val="left"/>
+      <w:pPr>
+        <w:ind w:left="1440" w:hanging="360"/>
+      </w:pPr>
+      <w:rPr>
+        <w:rFonts w:ascii="Courier New" w:hAnsi="Courier New" w:cs="Courier New" w:hint="default"/>
+      </w:rPr>
+    </w:lvl>
+    <w:lvl w:ilvl="2" w:tplc="04090005" w:tentative="1">
+      <w:start w:val="1"/>
+      <w:numFmt w:val="bullet"/>
+      <w:lvlText w:val=""/>
+      <w:lvlJc w:val="left"/>
+      <w:pPr>
+        <w:ind w:left="2160" w:hanging="360"/>
+      </w:pPr>
+      <w:rPr>
+        <w:rFonts w:ascii="Wingdings" w:hAnsi="Wingdings" w:hint="default"/>
+      </w:rPr>
+    </w:lvl>
+    <w:lvl w:ilvl="3" w:tplc="04090001" w:tentative="1">
+      <w:start w:val="1"/>
+      <w:numFmt w:val="bullet"/>
+      <w:lvlText w:val=""/>
+      <w:lvlJc w:val="left"/>
+      <w:pPr>
+        <w:ind w:left="2880" w:hanging="360"/>
+      </w:pPr>
+      <w:rPr>
+        <w:rFonts w:ascii="Symbol" w:hAnsi="Symbol" w:hint="default"/>
+      </w:rPr>
+    </w:lvl>
+    <w:lvl w:ilvl="4" w:tplc="04090003" w:tentative="1">
+      <w:start w:val="1"/>
+      <w:numFmt w:val="bullet"/>
+      <w:lvlText w:val="o"/>
+      <w:lvlJc w:val="left"/>
+      <w:pPr>
+        <w:ind w:left="3600" w:hanging="360"/>
+      </w:pPr>
+      <w:rPr>
+        <w:rFonts w:ascii="Courier New" w:hAnsi="Courier New" w:cs="Courier New" w:hint="default"/>
+      </w:rPr>
+    </w:lvl>
+    <w:lvl w:ilvl="5" w:tplc="04090005" w:tentative="1">
+      <w:start w:val="1"/>
+      <w:numFmt w:val="bullet"/>
+      <w:lvlText w:val=""/>
+      <w:lvlJc w:val="left"/>
+      <w:pPr>
+        <w:ind w:left="4320" w:hanging="360"/>
+      </w:pPr>
+      <w:rPr>
+        <w:rFonts w:ascii="Wingdings" w:hAnsi="Wingdings" w:hint="default"/>
+      </w:rPr>
+    </w:lvl>
+    <w:lvl w:ilvl="6" w:tplc="04090001" w:tentative="1">
+      <w:start w:val="1"/>
+      <w:numFmt w:val="bullet"/>
+      <w:lvlText w:val=""/>
+      <w:lvlJc w:val="left"/>
+      <w:pPr>
+        <w:ind w:left="5040" w:hanging="360"/>
+      </w:pPr>
+      <w:rPr>
+        <w:rFonts w:ascii="Symbol" w:hAnsi="Symbol" w:hint="default"/>
+      </w:rPr>
+    </w:lvl>
+    <w:lvl w:ilvl="7" w:tplc="04090003" w:tentative="1">
+      <w:start w:val="1"/>
+      <w:numFmt w:val="bullet"/>
+      <w:lvlText w:val="o"/>
+      <w:lvlJc w:val="left"/>
+      <w:pPr>
+        <w:ind w:left="5760" w:hanging="360"/>
+      </w:pPr>
+      <w:rPr>
+        <w:rFonts w:ascii="Courier New" w:hAnsi="Courier New" w:cs="Courier New" w:hint="default"/>
+      </w:rPr>
+    </w:lvl>
+    <w:lvl w:ilvl="8" w:tplc="04090005" w:tentative="1">
+      <w:start w:val="1"/>
+      <w:numFmt w:val="bullet"/>
+      <w:lvlText w:val=""/>
+      <w:lvlJc w:val="left"/>
+      <w:pPr>
+        <w:ind w:left="6480" w:hanging="360"/>
+      </w:pPr>
+      <w:rPr>
+        <w:rFonts w:ascii="Wingdings" w:hAnsi="Wingdings" w:hint="default"/>
+      </w:rPr>
+    </w:lvl>
+  </w:abstractNum>
+  <w:abstractNum w:abstractNumId="2" w15:restartNumberingAfterBreak="0">
     <w:nsid w:val="63934F9C"/>
     <w:multiLevelType w:val="hybridMultilevel"/>
     <w:tmpl w:val="98B6071C"/>
@@ -1982,7 +2395,119 @@
       </w:rPr>
     </w:lvl>
   </w:abstractNum>
-  <w:abstractNum w:abstractNumId="2" w15:restartNumberingAfterBreak="0">
+  <w:abstractNum w:abstractNumId="3" w15:restartNumberingAfterBreak="0">
+    <w:nsid w:val="71842EF3"/>
+    <w:multiLevelType w:val="hybridMultilevel"/>
+    <w:tmpl w:val="D098DE2C"/>
+    <w:lvl w:ilvl="0" w:tplc="634E4232">
+      <w:numFmt w:val="bullet"/>
+      <w:lvlText w:val=""/>
+      <w:lvlJc w:val="left"/>
+      <w:pPr>
+        <w:ind w:left="720" w:hanging="360"/>
+      </w:pPr>
+      <w:rPr>
+        <w:rFonts w:ascii="Wingdings" w:eastAsiaTheme="minorHAnsi" w:hAnsi="Wingdings" w:cstheme="minorBidi" w:hint="default"/>
+      </w:rPr>
+    </w:lvl>
+    <w:lvl w:ilvl="1" w:tplc="04090003" w:tentative="1">
+      <w:start w:val="1"/>
+      <w:numFmt w:val="bullet"/>
+      <w:lvlText w:val="o"/>
+      <w:lvlJc w:val="left"/>
+      <w:pPr>
+        <w:ind w:left="1440" w:hanging="360"/>
+      </w:pPr>
+      <w:rPr>
+        <w:rFonts w:ascii="Courier New" w:hAnsi="Courier New" w:cs="Courier New" w:hint="default"/>
+      </w:rPr>
+    </w:lvl>
+    <w:lvl w:ilvl="2" w:tplc="04090005" w:tentative="1">
+      <w:start w:val="1"/>
+      <w:numFmt w:val="bullet"/>
+      <w:lvlText w:val=""/>
+      <w:lvlJc w:val="left"/>
+      <w:pPr>
+        <w:ind w:left="2160" w:hanging="360"/>
+      </w:pPr>
+      <w:rPr>
+        <w:rFonts w:ascii="Wingdings" w:hAnsi="Wingdings" w:hint="default"/>
+      </w:rPr>
+    </w:lvl>
+    <w:lvl w:ilvl="3" w:tplc="04090001" w:tentative="1">
+      <w:start w:val="1"/>
+      <w:numFmt w:val="bullet"/>
+      <w:lvlText w:val=""/>
+      <w:lvlJc w:val="left"/>
+      <w:pPr>
+        <w:ind w:left="2880" w:hanging="360"/>
+      </w:pPr>
+      <w:rPr>
+        <w:rFonts w:ascii="Symbol" w:hAnsi="Symbol" w:hint="default"/>
+      </w:rPr>
+    </w:lvl>
+    <w:lvl w:ilvl="4" w:tplc="04090003" w:tentative="1">
+      <w:start w:val="1"/>
+      <w:numFmt w:val="bullet"/>
+      <w:lvlText w:val="o"/>
+      <w:lvlJc w:val="left"/>
+      <w:pPr>
+        <w:ind w:left="3600" w:hanging="360"/>
+      </w:pPr>
+      <w:rPr>
+        <w:rFonts w:ascii="Courier New" w:hAnsi="Courier New" w:cs="Courier New" w:hint="default"/>
+      </w:rPr>
+    </w:lvl>
+    <w:lvl w:ilvl="5" w:tplc="04090005" w:tentative="1">
+      <w:start w:val="1"/>
+      <w:numFmt w:val="bullet"/>
+      <w:lvlText w:val=""/>
+      <w:lvlJc w:val="left"/>
+      <w:pPr>
+        <w:ind w:left="4320" w:hanging="360"/>
+      </w:pPr>
+      <w:rPr>
+        <w:rFonts w:ascii="Wingdings" w:hAnsi="Wingdings" w:hint="default"/>
+      </w:rPr>
+    </w:lvl>
+    <w:lvl w:ilvl="6" w:tplc="04090001" w:tentative="1">
+      <w:start w:val="1"/>
+      <w:numFmt w:val="bullet"/>
+      <w:lvlText w:val=""/>
+      <w:lvlJc w:val="left"/>
+      <w:pPr>
+        <w:ind w:left="5040" w:hanging="360"/>
+      </w:pPr>
+      <w:rPr>
+        <w:rFonts w:ascii="Symbol" w:hAnsi="Symbol" w:hint="default"/>
+      </w:rPr>
+    </w:lvl>
+    <w:lvl w:ilvl="7" w:tplc="04090003" w:tentative="1">
+      <w:start w:val="1"/>
+      <w:numFmt w:val="bullet"/>
+      <w:lvlText w:val="o"/>
+      <w:lvlJc w:val="left"/>
+      <w:pPr>
+        <w:ind w:left="5760" w:hanging="360"/>
+      </w:pPr>
+      <w:rPr>
+        <w:rFonts w:ascii="Courier New" w:hAnsi="Courier New" w:cs="Courier New" w:hint="default"/>
+      </w:rPr>
+    </w:lvl>
+    <w:lvl w:ilvl="8" w:tplc="04090005" w:tentative="1">
+      <w:start w:val="1"/>
+      <w:numFmt w:val="bullet"/>
+      <w:lvlText w:val=""/>
+      <w:lvlJc w:val="left"/>
+      <w:pPr>
+        <w:ind w:left="6480" w:hanging="360"/>
+      </w:pPr>
+      <w:rPr>
+        <w:rFonts w:ascii="Wingdings" w:hAnsi="Wingdings" w:hint="default"/>
+      </w:rPr>
+    </w:lvl>
+  </w:abstractNum>
+  <w:abstractNum w:abstractNumId="4" w15:restartNumberingAfterBreak="0">
     <w:nsid w:val="76FF6A3B"/>
     <w:multiLevelType w:val="hybridMultilevel"/>
     <w:tmpl w:val="1B82B544"/>
@@ -2074,7 +2599,7 @@
       </w:pPr>
     </w:lvl>
   </w:abstractNum>
-  <w:abstractNum w:abstractNumId="3" w15:restartNumberingAfterBreak="0">
+  <w:abstractNum w:abstractNumId="5" w15:restartNumberingAfterBreak="0">
     <w:nsid w:val="7F4019AC"/>
     <w:multiLevelType w:val="hybridMultilevel"/>
     <w:tmpl w:val="4648A5BE"/>
@@ -2163,23 +2688,29 @@
       </w:pPr>
     </w:lvl>
   </w:abstractNum>
-  <w:num w:numId="1" w16cid:durableId="868881267">
+  <w:num w:numId="1">
+    <w:abstractNumId w:val="4"/>
+  </w:num>
+  <w:num w:numId="2">
+    <w:abstractNumId w:val="5"/>
+  </w:num>
+  <w:num w:numId="3">
+    <w:abstractNumId w:val="0"/>
+  </w:num>
+  <w:num w:numId="4">
     <w:abstractNumId w:val="2"/>
   </w:num>
-  <w:num w:numId="2" w16cid:durableId="2115201077">
+  <w:num w:numId="5">
+    <w:abstractNumId w:val="1"/>
+  </w:num>
+  <w:num w:numId="6">
     <w:abstractNumId w:val="3"/>
-  </w:num>
-  <w:num w:numId="3" w16cid:durableId="1188643058">
-    <w:abstractNumId w:val="0"/>
-  </w:num>
-  <w:num w:numId="4" w16cid:durableId="1462261321">
-    <w:abstractNumId w:val="1"/>
   </w:num>
 </w:numbering>
 </file>
 
 <file path=word/styles.xml><?xml version="1.0" encoding="utf-8"?>
-<w:styles xmlns:mc="http://schemas.openxmlformats.org/markup-compatibility/2006" xmlns:r="http://schemas.openxmlformats.org/officeDocument/2006/relationships" xmlns:w="http://schemas.openxmlformats.org/wordprocessingml/2006/main" xmlns:w14="http://schemas.microsoft.com/office/word/2010/wordml" xmlns:w15="http://schemas.microsoft.com/office/word/2012/wordml" xmlns:w16cex="http://schemas.microsoft.com/office/word/2018/wordml/cex" xmlns:w16cid="http://schemas.microsoft.com/office/word/2016/wordml/cid" xmlns:w16="http://schemas.microsoft.com/office/word/2018/wordml" xmlns:w16du="http://schemas.microsoft.com/office/word/2023/wordml/word16du" xmlns:w16sdtdh="http://schemas.microsoft.com/office/word/2020/wordml/sdtdatahash" xmlns:w16sdtfl="http://schemas.microsoft.com/office/word/2024/wordml/sdtformatlock" xmlns:w16se="http://schemas.microsoft.com/office/word/2015/wordml/symex" mc:Ignorable="w14 w15 w16se w16cid w16 w16cex w16sdtdh w16sdtfl w16du">
+<w:styles xmlns:mc="http://schemas.openxmlformats.org/markup-compatibility/2006" xmlns:r="http://schemas.openxmlformats.org/officeDocument/2006/relationships" xmlns:w="http://schemas.openxmlformats.org/wordprocessingml/2006/main" xmlns:w14="http://schemas.microsoft.com/office/word/2010/wordml" xmlns:w15="http://schemas.microsoft.com/office/word/2012/wordml" xmlns:w16se="http://schemas.microsoft.com/office/word/2015/wordml/symex" mc:Ignorable="w14 w15 w16se">
   <w:docDefaults>
     <w:rPrDefault>
       <w:rPr>
@@ -2197,7 +2728,7 @@
       </w:pPr>
     </w:pPrDefault>
   </w:docDefaults>
-  <w:latentStyles w:defLockedState="0" w:defUIPriority="99" w:defSemiHidden="0" w:defUnhideWhenUsed="0" w:defQFormat="0" w:count="376">
+  <w:latentStyles w:defLockedState="0" w:defUIPriority="99" w:defSemiHidden="0" w:defUnhideWhenUsed="0" w:defQFormat="0" w:count="371">
     <w:lsdException w:name="Normal" w:uiPriority="0" w:qFormat="1"/>
     <w:lsdException w:name="heading 1" w:uiPriority="9" w:qFormat="1"/>
     <w:lsdException w:name="heading 2" w:semiHidden="1" w:uiPriority="9" w:unhideWhenUsed="1" w:qFormat="1"/>
@@ -2569,11 +3100,6 @@
     <w:lsdException w:name="List Table 5 Dark Accent 6" w:uiPriority="50"/>
     <w:lsdException w:name="List Table 6 Colorful Accent 6" w:uiPriority="51"/>
     <w:lsdException w:name="List Table 7 Colorful Accent 6" w:uiPriority="52"/>
-    <w:lsdException w:name="Mention" w:semiHidden="1" w:unhideWhenUsed="1"/>
-    <w:lsdException w:name="Smart Hyperlink" w:semiHidden="1" w:unhideWhenUsed="1"/>
-    <w:lsdException w:name="Hashtag" w:semiHidden="1" w:unhideWhenUsed="1"/>
-    <w:lsdException w:name="Unresolved Mention" w:semiHidden="1" w:unhideWhenUsed="1"/>
-    <w:lsdException w:name="Smart Link" w:semiHidden="1" w:unhideWhenUsed="1"/>
   </w:latentStyles>
   <w:style w:type="paragraph" w:default="1" w:styleId="Normal">
     <w:name w:val="Normal"/>

</xml_diff>